<commit_message>
perf: optimize GPS pipeline, map rendering, compose recomposition, and backup streaming
- GPS persistence: chunk Room point writes into 100-point batches with write latency tracking; make checkpointing lock-free by reading immutable session snapshots
- Adaptive GPS sampling: dynamically scale location polling interval across moving (1s), stationary (3s), paused (4s), and GPS lost (5s) states
- MapLibre rendering: threshold live polyline updates to 25m distance or 10s intervals; decouple rider puck from route trail to avoid continuous GeoJSON re-generation; cap live display points to 500
- Compose stability: memoize derived strings and compass formatters in RacingTftDashboard to eliminate per-frame allocations during recomposition
- Streaming I/O: stream points.json in chunks directly into backup ZIP archive with on-the-fly SHA-256 calculation to eliminate heap memory spikes; stream multi-ride GPX exports ride-by-ride
</commit_message>
<xml_diff>
--- a/MotoLog_Full_Audit_Report.docx
+++ b/MotoLog_Full_Audit_Report.docx
@@ -7123,6 +7123,1745 @@
     </w:p>
     <w:p>
       <w:pPr>
+        <w:pStyle w:val="Heading2"/>
+        <w:bidi w:val="0"/>
+        <w:ind w:hanging="0" w:start="0" w:end="0"/>
+        <w:jc w:val="start"/>
+        <w:rPr/>
+      </w:pPr>
+      <w:r>
+        <w:rPr/>
+        <w:t>Performance improvement plan</w:t>
+      </w:r>
+    </w:p>
+    <w:p>
+      <w:pPr>
+        <w:pStyle w:val="BodyText"/>
+        <w:bidi w:val="0"/>
+        <w:spacing w:before="105" w:after="105"/>
+        <w:ind w:start="105" w:end="105"/>
+        <w:jc w:val="start"/>
+        <w:rPr/>
+      </w:pPr>
+      <w:r>
+        <w:rPr/>
+        <w:t>The app can be made significantly faster and more battery-efficient. The highest-impact areas are GPS processing, database writes, map rendering, Compose recomposition and large import/export operations.</w:t>
+      </w:r>
+    </w:p>
+    <w:p>
+      <w:pPr>
+        <w:pStyle w:val="Heading3"/>
+        <w:numPr>
+          <w:ilvl w:val="0"/>
+          <w:numId w:val="0"/>
+        </w:numPr>
+        <w:bidi w:val="0"/>
+        <w:spacing w:before="330" w:after="120"/>
+        <w:ind w:start="630"/>
+        <w:jc w:val="start"/>
+        <w:rPr/>
+      </w:pPr>
+      <w:r>
+        <w:rPr/>
+        <w:t>1. Fix and optimize the GPS persistence pipeline</w:t>
+      </w:r>
+    </w:p>
+    <w:p>
+      <w:pPr>
+        <w:pStyle w:val="BodyText"/>
+        <w:numPr>
+          <w:ilvl w:val="0"/>
+          <w:numId w:val="14"/>
+        </w:numPr>
+        <w:tabs>
+          <w:tab w:val="clear" w:pos="1134"/>
+          <w:tab w:val="left" w:pos="814" w:leader="none"/>
+        </w:tabs>
+        <w:bidi w:val="0"/>
+        <w:spacing w:before="105" w:after="0"/>
+        <w:ind w:hanging="283" w:start="814"/>
+        <w:jc w:val="start"/>
+        <w:rPr/>
+      </w:pPr>
+      <w:r>
+        <w:rPr/>
+        <w:t xml:space="preserve">Replace the unbounded </w:t>
+      </w:r>
+      <w:r>
+        <w:rPr>
+          <w:rStyle w:val="SourceText"/>
+        </w:rPr>
+        <w:t>Channel.UNLIMITED</w:t>
+      </w:r>
+      <w:r>
+        <w:rPr/>
+        <w:t xml:space="preserve"> point queue with a bounded queue and explicit backpressure behavior. </w:t>
+      </w:r>
+    </w:p>
+    <w:p>
+      <w:pPr>
+        <w:pStyle w:val="BodyText"/>
+        <w:numPr>
+          <w:ilvl w:val="0"/>
+          <w:numId w:val="14"/>
+        </w:numPr>
+        <w:tabs>
+          <w:tab w:val="clear" w:pos="1134"/>
+          <w:tab w:val="left" w:pos="814" w:leader="none"/>
+        </w:tabs>
+        <w:bidi w:val="0"/>
+        <w:spacing w:before="105" w:after="0"/>
+        <w:ind w:hanging="283" w:start="814"/>
+        <w:jc w:val="start"/>
+        <w:rPr/>
+      </w:pPr>
+      <w:r>
+        <w:rPr/>
+        <w:t xml:space="preserve">Use one dedicated database-writer coroutine and controlled Room batches, typically 50-200 points depending on device testing. </w:t>
+      </w:r>
+    </w:p>
+    <w:p>
+      <w:pPr>
+        <w:pStyle w:val="BodyText"/>
+        <w:numPr>
+          <w:ilvl w:val="0"/>
+          <w:numId w:val="14"/>
+        </w:numPr>
+        <w:tabs>
+          <w:tab w:val="clear" w:pos="1134"/>
+          <w:tab w:val="left" w:pos="814" w:leader="none"/>
+        </w:tabs>
+        <w:bidi w:val="0"/>
+        <w:spacing w:before="105" w:after="0"/>
+        <w:ind w:hanging="283" w:start="814"/>
+        <w:jc w:val="start"/>
+        <w:rPr/>
+      </w:pPr>
+      <w:r>
+        <w:rPr/>
+        <w:t xml:space="preserve">Retry transient database failures with bounded exponential backoff and surface persistent failures to the notification/UI. </w:t>
+      </w:r>
+    </w:p>
+    <w:p>
+      <w:pPr>
+        <w:pStyle w:val="BodyText"/>
+        <w:numPr>
+          <w:ilvl w:val="0"/>
+          <w:numId w:val="14"/>
+        </w:numPr>
+        <w:tabs>
+          <w:tab w:val="clear" w:pos="1134"/>
+          <w:tab w:val="left" w:pos="814" w:leader="none"/>
+        </w:tabs>
+        <w:bidi w:val="0"/>
+        <w:spacing w:before="105" w:after="0"/>
+        <w:ind w:hanging="283" w:start="814"/>
+        <w:jc w:val="start"/>
+        <w:rPr/>
+      </w:pPr>
+      <w:r>
+        <w:rPr/>
+        <w:t xml:space="preserve">Do not persist rejected GPS samples; they increase database size and route-rendering work without contributing valid statistics. </w:t>
+      </w:r>
+    </w:p>
+    <w:p>
+      <w:pPr>
+        <w:pStyle w:val="BodyText"/>
+        <w:numPr>
+          <w:ilvl w:val="0"/>
+          <w:numId w:val="14"/>
+        </w:numPr>
+        <w:tabs>
+          <w:tab w:val="clear" w:pos="1134"/>
+          <w:tab w:val="left" w:pos="814" w:leader="none"/>
+        </w:tabs>
+        <w:bidi w:val="0"/>
+        <w:ind w:hanging="283" w:start="814"/>
+        <w:jc w:val="start"/>
+        <w:rPr/>
+      </w:pPr>
+      <w:r>
+        <w:rPr/>
+        <w:t xml:space="preserve">Measure write latency and queue depth during long rides. </w:t>
+      </w:r>
+    </w:p>
+    <w:p>
+      <w:pPr>
+        <w:pStyle w:val="Heading3"/>
+        <w:numPr>
+          <w:ilvl w:val="0"/>
+          <w:numId w:val="0"/>
+        </w:numPr>
+        <w:bidi w:val="0"/>
+        <w:spacing w:before="330" w:after="120"/>
+        <w:ind w:start="630"/>
+        <w:jc w:val="start"/>
+        <w:rPr/>
+      </w:pPr>
+      <w:r>
+        <w:rPr/>
+        <w:t>2. Use adaptive GPS sampling</w:t>
+      </w:r>
+    </w:p>
+    <w:p>
+      <w:pPr>
+        <w:pStyle w:val="BodyText"/>
+        <w:bidi w:val="0"/>
+        <w:spacing w:before="105" w:after="105"/>
+        <w:ind w:start="105" w:end="105"/>
+        <w:jc w:val="start"/>
+        <w:rPr/>
+      </w:pPr>
+      <w:r>
+        <w:rPr/>
+        <w:t>Requesting high-accuracy, one-second updates continuously consumes battery and creates unnecessary processing while stationary.</w:t>
+      </w:r>
+    </w:p>
+    <w:p>
+      <w:pPr>
+        <w:pStyle w:val="BodyText"/>
+        <w:numPr>
+          <w:ilvl w:val="0"/>
+          <w:numId w:val="15"/>
+        </w:numPr>
+        <w:tabs>
+          <w:tab w:val="clear" w:pos="1134"/>
+          <w:tab w:val="left" w:pos="814" w:leader="none"/>
+        </w:tabs>
+        <w:bidi w:val="0"/>
+        <w:spacing w:before="105" w:after="0"/>
+        <w:ind w:hanging="283" w:start="814"/>
+        <w:jc w:val="start"/>
+        <w:rPr/>
+      </w:pPr>
+      <w:r>
+        <w:rPr/>
+        <w:t xml:space="preserve">Moving: approximately one-second updates. </w:t>
+      </w:r>
+    </w:p>
+    <w:p>
+      <w:pPr>
+        <w:pStyle w:val="BodyText"/>
+        <w:numPr>
+          <w:ilvl w:val="0"/>
+          <w:numId w:val="15"/>
+        </w:numPr>
+        <w:tabs>
+          <w:tab w:val="clear" w:pos="1134"/>
+          <w:tab w:val="left" w:pos="814" w:leader="none"/>
+        </w:tabs>
+        <w:bidi w:val="0"/>
+        <w:spacing w:before="105" w:after="0"/>
+        <w:ind w:hanging="283" w:start="814"/>
+        <w:jc w:val="start"/>
+        <w:rPr/>
+      </w:pPr>
+      <w:r>
+        <w:rPr/>
+        <w:t xml:space="preserve">Slow or stationary: three-to-five-second updates. </w:t>
+      </w:r>
+    </w:p>
+    <w:p>
+      <w:pPr>
+        <w:pStyle w:val="BodyText"/>
+        <w:numPr>
+          <w:ilvl w:val="0"/>
+          <w:numId w:val="15"/>
+        </w:numPr>
+        <w:tabs>
+          <w:tab w:val="clear" w:pos="1134"/>
+          <w:tab w:val="left" w:pos="814" w:leader="none"/>
+        </w:tabs>
+        <w:bidi w:val="0"/>
+        <w:spacing w:before="105" w:after="0"/>
+        <w:ind w:hanging="283" w:start="814"/>
+        <w:jc w:val="start"/>
+        <w:rPr/>
+      </w:pPr>
+      <w:r>
+        <w:rPr/>
+        <w:t xml:space="preserve">Auto-paused: reduce the update rate while preserving reliable resume detection. </w:t>
+      </w:r>
+    </w:p>
+    <w:p>
+      <w:pPr>
+        <w:pStyle w:val="BodyText"/>
+        <w:numPr>
+          <w:ilvl w:val="0"/>
+          <w:numId w:val="15"/>
+        </w:numPr>
+        <w:tabs>
+          <w:tab w:val="clear" w:pos="1134"/>
+          <w:tab w:val="left" w:pos="814" w:leader="none"/>
+        </w:tabs>
+        <w:bidi w:val="0"/>
+        <w:spacing w:before="105" w:after="0"/>
+        <w:ind w:hanging="283" w:start="814"/>
+        <w:jc w:val="start"/>
+        <w:rPr/>
+      </w:pPr>
+      <w:r>
+        <w:rPr/>
+        <w:t xml:space="preserve">GPS lost: progressively back off and restore the normal interval after a valid fix. </w:t>
+      </w:r>
+    </w:p>
+    <w:p>
+      <w:pPr>
+        <w:pStyle w:val="BodyText"/>
+        <w:numPr>
+          <w:ilvl w:val="0"/>
+          <w:numId w:val="15"/>
+        </w:numPr>
+        <w:tabs>
+          <w:tab w:val="clear" w:pos="1134"/>
+          <w:tab w:val="left" w:pos="814" w:leader="none"/>
+        </w:tabs>
+        <w:bidi w:val="0"/>
+        <w:ind w:hanging="283" w:start="814"/>
+        <w:jc w:val="start"/>
+        <w:rPr/>
+      </w:pPr>
+      <w:r>
+        <w:rPr/>
+        <w:t xml:space="preserve">Expose battery-saver tracking mode and verify its accuracy against representative rides. </w:t>
+      </w:r>
+    </w:p>
+    <w:p>
+      <w:pPr>
+        <w:pStyle w:val="Heading3"/>
+        <w:numPr>
+          <w:ilvl w:val="0"/>
+          <w:numId w:val="0"/>
+        </w:numPr>
+        <w:bidi w:val="0"/>
+        <w:spacing w:before="330" w:after="120"/>
+        <w:ind w:start="630"/>
+        <w:jc w:val="start"/>
+        <w:rPr/>
+      </w:pPr>
+      <w:r>
+        <w:rPr/>
+        <w:t>3. Confine tracking state to one coroutine</w:t>
+      </w:r>
+    </w:p>
+    <w:p>
+      <w:pPr>
+        <w:pStyle w:val="BodyText"/>
+        <w:bidi w:val="0"/>
+        <w:spacing w:before="105" w:after="105"/>
+        <w:ind w:start="105" w:end="105"/>
+        <w:jc w:val="start"/>
+        <w:rPr/>
+      </w:pPr>
+      <w:r>
+        <w:rPr/>
+        <w:t xml:space="preserve">Move </w:t>
+      </w:r>
+      <w:r>
+        <w:rPr>
+          <w:rStyle w:val="SourceText"/>
+        </w:rPr>
+        <w:t>RideCalculator</w:t>
+      </w:r>
+      <w:r>
+        <w:rPr/>
+        <w:t>, pause state, speed alerts and mutable tracking statistics onto one actor/event loop, or protect them with a mutex. This avoids race conditions and reduces synchronization overhead from multiple concurrent callers.</w:t>
+      </w:r>
+    </w:p>
+    <w:p>
+      <w:pPr>
+        <w:pStyle w:val="BodyText"/>
+        <w:bidi w:val="0"/>
+        <w:spacing w:before="105" w:after="105"/>
+        <w:ind w:start="105" w:end="105"/>
+        <w:jc w:val="start"/>
+        <w:rPr/>
+      </w:pPr>
+      <w:r>
+        <w:rPr/>
+        <w:t>Commands such as start, pause, resume, stop and location updates should be processed sequentially. Checkpoint and notification code should read immutable snapshots rather than touching mutable calculator state concurrently.</w:t>
+      </w:r>
+    </w:p>
+    <w:p>
+      <w:pPr>
+        <w:pStyle w:val="Heading3"/>
+        <w:numPr>
+          <w:ilvl w:val="0"/>
+          <w:numId w:val="0"/>
+        </w:numPr>
+        <w:bidi w:val="0"/>
+        <w:spacing w:before="330" w:after="120"/>
+        <w:ind w:start="630"/>
+        <w:jc w:val="start"/>
+        <w:rPr/>
+      </w:pPr>
+      <w:r>
+        <w:rPr/>
+        <w:t>4. Optimize MapLibre rendering</w:t>
+      </w:r>
+    </w:p>
+    <w:p>
+      <w:pPr>
+        <w:pStyle w:val="BodyText"/>
+        <w:numPr>
+          <w:ilvl w:val="0"/>
+          <w:numId w:val="16"/>
+        </w:numPr>
+        <w:tabs>
+          <w:tab w:val="clear" w:pos="1134"/>
+          <w:tab w:val="left" w:pos="814" w:leader="none"/>
+        </w:tabs>
+        <w:bidi w:val="0"/>
+        <w:spacing w:before="105" w:after="0"/>
+        <w:ind w:hanging="283" w:start="814"/>
+        <w:jc w:val="start"/>
+        <w:rPr/>
+      </w:pPr>
+      <w:r>
+        <w:rPr/>
+        <w:t xml:space="preserve">Downsample route geometry before passing it to MapLibre. </w:t>
+      </w:r>
+    </w:p>
+    <w:p>
+      <w:pPr>
+        <w:pStyle w:val="BodyText"/>
+        <w:numPr>
+          <w:ilvl w:val="0"/>
+          <w:numId w:val="16"/>
+        </w:numPr>
+        <w:tabs>
+          <w:tab w:val="clear" w:pos="1134"/>
+          <w:tab w:val="left" w:pos="814" w:leader="none"/>
+        </w:tabs>
+        <w:bidi w:val="0"/>
+        <w:spacing w:before="105" w:after="0"/>
+        <w:ind w:hanging="283" w:start="814"/>
+        <w:jc w:val="start"/>
+        <w:rPr/>
+      </w:pPr>
+      <w:r>
+        <w:rPr/>
+        <w:t xml:space="preserve">Cache route geometry and elevation data. </w:t>
+      </w:r>
+    </w:p>
+    <w:p>
+      <w:pPr>
+        <w:pStyle w:val="BodyText"/>
+        <w:numPr>
+          <w:ilvl w:val="0"/>
+          <w:numId w:val="16"/>
+        </w:numPr>
+        <w:tabs>
+          <w:tab w:val="clear" w:pos="1134"/>
+          <w:tab w:val="left" w:pos="814" w:leader="none"/>
+        </w:tabs>
+        <w:bidi w:val="0"/>
+        <w:spacing w:before="105" w:after="0"/>
+        <w:ind w:hanging="283" w:start="814"/>
+        <w:jc w:val="start"/>
+        <w:rPr/>
+      </w:pPr>
+      <w:r>
+        <w:rPr/>
+        <w:t xml:space="preserve">Do not rebuild the complete route on every GPS update. </w:t>
+      </w:r>
+    </w:p>
+    <w:p>
+      <w:pPr>
+        <w:pStyle w:val="BodyText"/>
+        <w:numPr>
+          <w:ilvl w:val="0"/>
+          <w:numId w:val="16"/>
+        </w:numPr>
+        <w:tabs>
+          <w:tab w:val="clear" w:pos="1134"/>
+          <w:tab w:val="left" w:pos="814" w:leader="none"/>
+        </w:tabs>
+        <w:bidi w:val="0"/>
+        <w:spacing w:before="105" w:after="0"/>
+        <w:ind w:hanging="283" w:start="814"/>
+        <w:jc w:val="start"/>
+        <w:rPr/>
+      </w:pPr>
+      <w:r>
+        <w:rPr/>
+        <w:t xml:space="preserve">Update only the current-location marker during active tracking. </w:t>
+      </w:r>
+    </w:p>
+    <w:p>
+      <w:pPr>
+        <w:pStyle w:val="BodyText"/>
+        <w:numPr>
+          <w:ilvl w:val="0"/>
+          <w:numId w:val="16"/>
+        </w:numPr>
+        <w:tabs>
+          <w:tab w:val="clear" w:pos="1134"/>
+          <w:tab w:val="left" w:pos="814" w:leader="none"/>
+        </w:tabs>
+        <w:bidi w:val="0"/>
+        <w:spacing w:before="105" w:after="0"/>
+        <w:ind w:hanging="283" w:start="814"/>
+        <w:jc w:val="start"/>
+        <w:rPr/>
+      </w:pPr>
+      <w:r>
+        <w:rPr/>
+        <w:t xml:space="preserve">Re-render route geometry only after a meaningful distance threshold, such as 25-100 meters, or after a time interval. </w:t>
+      </w:r>
+    </w:p>
+    <w:p>
+      <w:pPr>
+        <w:pStyle w:val="BodyText"/>
+        <w:numPr>
+          <w:ilvl w:val="0"/>
+          <w:numId w:val="16"/>
+        </w:numPr>
+        <w:tabs>
+          <w:tab w:val="clear" w:pos="1134"/>
+          <w:tab w:val="left" w:pos="814" w:leader="none"/>
+        </w:tabs>
+        <w:bidi w:val="0"/>
+        <w:spacing w:before="105" w:after="0"/>
+        <w:ind w:hanging="283" w:start="814"/>
+        <w:jc w:val="start"/>
+        <w:rPr/>
+      </w:pPr>
+      <w:r>
+        <w:rPr/>
+        <w:t xml:space="preserve">Avoid reloading the full map style when only telemetry visibility or theme state changes. </w:t>
+      </w:r>
+    </w:p>
+    <w:p>
+      <w:pPr>
+        <w:pStyle w:val="BodyText"/>
+        <w:numPr>
+          <w:ilvl w:val="0"/>
+          <w:numId w:val="16"/>
+        </w:numPr>
+        <w:tabs>
+          <w:tab w:val="clear" w:pos="1134"/>
+          <w:tab w:val="left" w:pos="814" w:leader="none"/>
+        </w:tabs>
+        <w:bidi w:val="0"/>
+        <w:ind w:hanging="283" w:start="814"/>
+        <w:jc w:val="start"/>
+        <w:rPr/>
+      </w:pPr>
+      <w:r>
+        <w:rPr/>
+        <w:t xml:space="preserve">Guard the downsampler against duplicate coordinates and enforce its maximum-point contract. </w:t>
+      </w:r>
+    </w:p>
+    <w:p>
+      <w:pPr>
+        <w:pStyle w:val="Heading3"/>
+        <w:numPr>
+          <w:ilvl w:val="0"/>
+          <w:numId w:val="0"/>
+        </w:numPr>
+        <w:bidi w:val="0"/>
+        <w:spacing w:before="330" w:after="120"/>
+        <w:ind w:start="630"/>
+        <w:jc w:val="start"/>
+        <w:rPr/>
+      </w:pPr>
+      <w:r>
+        <w:rPr/>
+        <w:t>5. Reduce Compose recompositions</w:t>
+      </w:r>
+    </w:p>
+    <w:p>
+      <w:pPr>
+        <w:pStyle w:val="BodyText"/>
+        <w:numPr>
+          <w:ilvl w:val="0"/>
+          <w:numId w:val="17"/>
+        </w:numPr>
+        <w:tabs>
+          <w:tab w:val="clear" w:pos="1134"/>
+          <w:tab w:val="left" w:pos="814" w:leader="none"/>
+        </w:tabs>
+        <w:bidi w:val="0"/>
+        <w:spacing w:before="105" w:after="0"/>
+        <w:ind w:hanging="283" w:start="814"/>
+        <w:jc w:val="start"/>
+        <w:rPr/>
+      </w:pPr>
+      <w:r>
+        <w:rPr/>
+        <w:t xml:space="preserve">Split large cockpit/dashboard composables into smaller stable components. </w:t>
+      </w:r>
+    </w:p>
+    <w:p>
+      <w:pPr>
+        <w:pStyle w:val="BodyText"/>
+        <w:numPr>
+          <w:ilvl w:val="0"/>
+          <w:numId w:val="17"/>
+        </w:numPr>
+        <w:tabs>
+          <w:tab w:val="clear" w:pos="1134"/>
+          <w:tab w:val="left" w:pos="814" w:leader="none"/>
+        </w:tabs>
+        <w:bidi w:val="0"/>
+        <w:spacing w:before="105" w:after="0"/>
+        <w:ind w:hanging="283" w:start="814"/>
+        <w:jc w:val="start"/>
+        <w:rPr/>
+      </w:pPr>
+      <w:r>
+        <w:rPr/>
+        <w:t xml:space="preserve">Use immutable UI state models and stable collections. </w:t>
+      </w:r>
+    </w:p>
+    <w:p>
+      <w:pPr>
+        <w:pStyle w:val="BodyText"/>
+        <w:numPr>
+          <w:ilvl w:val="0"/>
+          <w:numId w:val="17"/>
+        </w:numPr>
+        <w:tabs>
+          <w:tab w:val="clear" w:pos="1134"/>
+          <w:tab w:val="left" w:pos="814" w:leader="none"/>
+        </w:tabs>
+        <w:bidi w:val="0"/>
+        <w:spacing w:before="105" w:after="0"/>
+        <w:ind w:hanging="283" w:start="814"/>
+        <w:jc w:val="start"/>
+        <w:rPr/>
+      </w:pPr>
+      <w:r>
+        <w:rPr/>
+        <w:t xml:space="preserve">Keep rapidly changing telemetry separate from static cockpit configuration. </w:t>
+      </w:r>
+    </w:p>
+    <w:p>
+      <w:pPr>
+        <w:pStyle w:val="BodyText"/>
+        <w:numPr>
+          <w:ilvl w:val="0"/>
+          <w:numId w:val="17"/>
+        </w:numPr>
+        <w:tabs>
+          <w:tab w:val="clear" w:pos="1134"/>
+          <w:tab w:val="left" w:pos="814" w:leader="none"/>
+        </w:tabs>
+        <w:bidi w:val="0"/>
+        <w:spacing w:before="105" w:after="0"/>
+        <w:ind w:hanging="283" w:start="814"/>
+        <w:jc w:val="start"/>
+        <w:rPr/>
+      </w:pPr>
+      <w:r>
+        <w:rPr/>
+        <w:t xml:space="preserve">Use </w:t>
+      </w:r>
+      <w:r>
+        <w:rPr>
+          <w:rStyle w:val="SourceText"/>
+        </w:rPr>
+        <w:t>remember</w:t>
+      </w:r>
+      <w:r>
+        <w:rPr/>
+        <w:t xml:space="preserve"> for expensive calculations, paths, formatters and derived values. </w:t>
+      </w:r>
+    </w:p>
+    <w:p>
+      <w:pPr>
+        <w:pStyle w:val="BodyText"/>
+        <w:numPr>
+          <w:ilvl w:val="0"/>
+          <w:numId w:val="17"/>
+        </w:numPr>
+        <w:tabs>
+          <w:tab w:val="clear" w:pos="1134"/>
+          <w:tab w:val="left" w:pos="814" w:leader="none"/>
+        </w:tabs>
+        <w:bidi w:val="0"/>
+        <w:spacing w:before="105" w:after="0"/>
+        <w:ind w:hanging="283" w:start="814"/>
+        <w:jc w:val="start"/>
+        <w:rPr/>
+      </w:pPr>
+      <w:r>
+        <w:rPr/>
+        <w:t xml:space="preserve">Avoid creating lists, lambdas and formatters inside frequently recomposed dashboard functions. </w:t>
+      </w:r>
+    </w:p>
+    <w:p>
+      <w:pPr>
+        <w:pStyle w:val="BodyText"/>
+        <w:numPr>
+          <w:ilvl w:val="0"/>
+          <w:numId w:val="17"/>
+        </w:numPr>
+        <w:tabs>
+          <w:tab w:val="clear" w:pos="1134"/>
+          <w:tab w:val="left" w:pos="814" w:leader="none"/>
+        </w:tabs>
+        <w:bidi w:val="0"/>
+        <w:ind w:hanging="283" w:start="814"/>
+        <w:jc w:val="start"/>
+        <w:rPr/>
+      </w:pPr>
+      <w:r>
+        <w:rPr/>
+        <w:t xml:space="preserve">Do not collect unrelated settings in the live screen when only one setting is needed. </w:t>
+      </w:r>
+    </w:p>
+    <w:p>
+      <w:pPr>
+        <w:pStyle w:val="Heading3"/>
+        <w:numPr>
+          <w:ilvl w:val="0"/>
+          <w:numId w:val="0"/>
+        </w:numPr>
+        <w:bidi w:val="0"/>
+        <w:spacing w:before="330" w:after="120"/>
+        <w:ind w:start="630"/>
+        <w:jc w:val="start"/>
+        <w:rPr/>
+      </w:pPr>
+      <w:r>
+        <w:rPr/>
+        <w:t>6. Optimize history and ride-detail screens</w:t>
+      </w:r>
+    </w:p>
+    <w:p>
+      <w:pPr>
+        <w:pStyle w:val="BodyText"/>
+        <w:numPr>
+          <w:ilvl w:val="0"/>
+          <w:numId w:val="18"/>
+        </w:numPr>
+        <w:tabs>
+          <w:tab w:val="clear" w:pos="1134"/>
+          <w:tab w:val="left" w:pos="814" w:leader="none"/>
+        </w:tabs>
+        <w:bidi w:val="0"/>
+        <w:spacing w:before="105" w:after="0"/>
+        <w:ind w:hanging="283" w:start="814"/>
+        <w:jc w:val="start"/>
+        <w:rPr/>
+      </w:pPr>
+      <w:r>
+        <w:rPr/>
+        <w:t xml:space="preserve">Load route points only when the detail screen needs them. </w:t>
+      </w:r>
+    </w:p>
+    <w:p>
+      <w:pPr>
+        <w:pStyle w:val="BodyText"/>
+        <w:numPr>
+          <w:ilvl w:val="0"/>
+          <w:numId w:val="18"/>
+        </w:numPr>
+        <w:tabs>
+          <w:tab w:val="clear" w:pos="1134"/>
+          <w:tab w:val="left" w:pos="814" w:leader="none"/>
+        </w:tabs>
+        <w:bidi w:val="0"/>
+        <w:spacing w:before="105" w:after="0"/>
+        <w:ind w:hanging="283" w:start="814"/>
+        <w:jc w:val="start"/>
+        <w:rPr/>
+      </w:pPr>
+      <w:r>
+        <w:rPr/>
+        <w:t xml:space="preserve">Use SQL-side filtering, pagination or downsampling instead of loading every point immediately. </w:t>
+      </w:r>
+    </w:p>
+    <w:p>
+      <w:pPr>
+        <w:pStyle w:val="BodyText"/>
+        <w:numPr>
+          <w:ilvl w:val="0"/>
+          <w:numId w:val="18"/>
+        </w:numPr>
+        <w:tabs>
+          <w:tab w:val="clear" w:pos="1134"/>
+          <w:tab w:val="left" w:pos="814" w:leader="none"/>
+        </w:tabs>
+        <w:bidi w:val="0"/>
+        <w:spacing w:before="105" w:after="0"/>
+        <w:ind w:hanging="283" w:start="814"/>
+        <w:jc w:val="start"/>
+        <w:rPr/>
+      </w:pPr>
+      <w:r>
+        <w:rPr/>
+        <w:t xml:space="preserve">Cache prepared route and graph data for repeated screen visits. </w:t>
+      </w:r>
+    </w:p>
+    <w:p>
+      <w:pPr>
+        <w:pStyle w:val="BodyText"/>
+        <w:numPr>
+          <w:ilvl w:val="0"/>
+          <w:numId w:val="18"/>
+        </w:numPr>
+        <w:tabs>
+          <w:tab w:val="clear" w:pos="1134"/>
+          <w:tab w:val="left" w:pos="814" w:leader="none"/>
+        </w:tabs>
+        <w:bidi w:val="0"/>
+        <w:spacing w:before="105" w:after="0"/>
+        <w:ind w:hanging="283" w:start="814"/>
+        <w:jc w:val="start"/>
+        <w:rPr/>
+      </w:pPr>
+      <w:r>
+        <w:rPr/>
+        <w:t xml:space="preserve">Run elevation and route preparation on </w:t>
+      </w:r>
+      <w:r>
+        <w:rPr>
+          <w:rStyle w:val="SourceText"/>
+        </w:rPr>
+        <w:t>Dispatchers.Default</w:t>
+      </w:r>
+      <w:r>
+        <w:rPr/>
+        <w:t xml:space="preserve"> or </w:t>
+      </w:r>
+      <w:r>
+        <w:rPr>
+          <w:rStyle w:val="SourceText"/>
+        </w:rPr>
+        <w:t>Dispatchers.IO</w:t>
+      </w:r>
+      <w:r>
+        <w:rPr/>
+        <w:t xml:space="preserve">, never on the main thread. </w:t>
+      </w:r>
+    </w:p>
+    <w:p>
+      <w:pPr>
+        <w:pStyle w:val="BodyText"/>
+        <w:numPr>
+          <w:ilvl w:val="0"/>
+          <w:numId w:val="18"/>
+        </w:numPr>
+        <w:tabs>
+          <w:tab w:val="clear" w:pos="1134"/>
+          <w:tab w:val="left" w:pos="814" w:leader="none"/>
+        </w:tabs>
+        <w:bidi w:val="0"/>
+        <w:ind w:hanging="283" w:start="814"/>
+        <w:jc w:val="start"/>
+        <w:rPr/>
+      </w:pPr>
+      <w:r>
+        <w:rPr/>
+        <w:t xml:space="preserve">Render a simplified preview first, then refine it asynchronously. </w:t>
+      </w:r>
+    </w:p>
+    <w:p>
+      <w:pPr>
+        <w:pStyle w:val="Heading3"/>
+        <w:numPr>
+          <w:ilvl w:val="0"/>
+          <w:numId w:val="0"/>
+        </w:numPr>
+        <w:bidi w:val="0"/>
+        <w:spacing w:before="330" w:after="120"/>
+        <w:ind w:start="630"/>
+        <w:jc w:val="start"/>
+        <w:rPr/>
+      </w:pPr>
+      <w:r>
+        <w:rPr/>
+        <w:t>7. Stream backup and import/export operations</w:t>
+      </w:r>
+    </w:p>
+    <w:p>
+      <w:pPr>
+        <w:pStyle w:val="BodyText"/>
+        <w:numPr>
+          <w:ilvl w:val="0"/>
+          <w:numId w:val="19"/>
+        </w:numPr>
+        <w:tabs>
+          <w:tab w:val="clear" w:pos="1134"/>
+          <w:tab w:val="left" w:pos="814" w:leader="none"/>
+        </w:tabs>
+        <w:bidi w:val="0"/>
+        <w:spacing w:before="105" w:after="0"/>
+        <w:ind w:hanging="283" w:start="814"/>
+        <w:jc w:val="start"/>
+        <w:rPr/>
+      </w:pPr>
+      <w:r>
+        <w:rPr/>
+        <w:t xml:space="preserve">Do not load every database table into memory at once for backup. </w:t>
+      </w:r>
+    </w:p>
+    <w:p>
+      <w:pPr>
+        <w:pStyle w:val="BodyText"/>
+        <w:numPr>
+          <w:ilvl w:val="0"/>
+          <w:numId w:val="19"/>
+        </w:numPr>
+        <w:tabs>
+          <w:tab w:val="clear" w:pos="1134"/>
+          <w:tab w:val="left" w:pos="814" w:leader="none"/>
+        </w:tabs>
+        <w:bidi w:val="0"/>
+        <w:spacing w:before="105" w:after="0"/>
+        <w:ind w:hanging="283" w:start="814"/>
+        <w:jc w:val="start"/>
+        <w:rPr/>
+      </w:pPr>
+      <w:r>
+        <w:rPr/>
+        <w:t xml:space="preserve">Stream large point collections in chunks. </w:t>
+      </w:r>
+    </w:p>
+    <w:p>
+      <w:pPr>
+        <w:pStyle w:val="BodyText"/>
+        <w:numPr>
+          <w:ilvl w:val="0"/>
+          <w:numId w:val="19"/>
+        </w:numPr>
+        <w:tabs>
+          <w:tab w:val="clear" w:pos="1134"/>
+          <w:tab w:val="left" w:pos="814" w:leader="none"/>
+        </w:tabs>
+        <w:bidi w:val="0"/>
+        <w:spacing w:before="105" w:after="0"/>
+        <w:ind w:hanging="283" w:start="814"/>
+        <w:jc w:val="start"/>
+        <w:rPr/>
+      </w:pPr>
+      <w:r>
+        <w:rPr/>
+        <w:t xml:space="preserve">Use bounded ZIP reads rather than unrestricted </w:t>
+      </w:r>
+      <w:r>
+        <w:rPr>
+          <w:rStyle w:val="SourceText"/>
+        </w:rPr>
+        <w:t>readBytes()</w:t>
+      </w:r>
+      <w:r>
+        <w:rPr/>
+        <w:t xml:space="preserve">. </w:t>
+      </w:r>
+    </w:p>
+    <w:p>
+      <w:pPr>
+        <w:pStyle w:val="BodyText"/>
+        <w:numPr>
+          <w:ilvl w:val="0"/>
+          <w:numId w:val="19"/>
+        </w:numPr>
+        <w:tabs>
+          <w:tab w:val="clear" w:pos="1134"/>
+          <w:tab w:val="left" w:pos="814" w:leader="none"/>
+        </w:tabs>
+        <w:bidi w:val="0"/>
+        <w:spacing w:before="105" w:after="0"/>
+        <w:ind w:hanging="283" w:start="814"/>
+        <w:jc w:val="start"/>
+        <w:rPr/>
+      </w:pPr>
+      <w:r>
+        <w:rPr/>
+        <w:t xml:space="preserve">Move GPX/CSV/backup processing off the UI scope. </w:t>
+      </w:r>
+    </w:p>
+    <w:p>
+      <w:pPr>
+        <w:pStyle w:val="BodyText"/>
+        <w:numPr>
+          <w:ilvl w:val="0"/>
+          <w:numId w:val="19"/>
+        </w:numPr>
+        <w:tabs>
+          <w:tab w:val="clear" w:pos="1134"/>
+          <w:tab w:val="left" w:pos="814" w:leader="none"/>
+        </w:tabs>
+        <w:bidi w:val="0"/>
+        <w:spacing w:before="105" w:after="0"/>
+        <w:ind w:hanging="283" w:start="814"/>
+        <w:jc w:val="start"/>
+        <w:rPr/>
+      </w:pPr>
+      <w:r>
+        <w:rPr/>
+        <w:t xml:space="preserve">Show progress and provide cancellation for large operations. </w:t>
+      </w:r>
+    </w:p>
+    <w:p>
+      <w:pPr>
+        <w:pStyle w:val="BodyText"/>
+        <w:numPr>
+          <w:ilvl w:val="0"/>
+          <w:numId w:val="19"/>
+        </w:numPr>
+        <w:tabs>
+          <w:tab w:val="clear" w:pos="1134"/>
+          <w:tab w:val="left" w:pos="814" w:leader="none"/>
+        </w:tabs>
+        <w:bidi w:val="0"/>
+        <w:ind w:hanging="283" w:start="814"/>
+        <w:jc w:val="start"/>
+        <w:rPr/>
+      </w:pPr>
+      <w:r>
+        <w:rPr/>
+        <w:t xml:space="preserve">Measure peak heap usage with large GPX files and high-mileage databases. </w:t>
+      </w:r>
+    </w:p>
+    <w:p>
+      <w:pPr>
+        <w:pStyle w:val="Heading3"/>
+        <w:numPr>
+          <w:ilvl w:val="0"/>
+          <w:numId w:val="0"/>
+        </w:numPr>
+        <w:bidi w:val="0"/>
+        <w:spacing w:before="330" w:after="120"/>
+        <w:ind w:start="630"/>
+        <w:jc w:val="start"/>
+        <w:rPr/>
+      </w:pPr>
+      <w:r>
+        <w:rPr/>
+        <w:t>8. Optimize notifications and formatting</w:t>
+      </w:r>
+    </w:p>
+    <w:p>
+      <w:pPr>
+        <w:pStyle w:val="BodyText"/>
+        <w:numPr>
+          <w:ilvl w:val="0"/>
+          <w:numId w:val="20"/>
+        </w:numPr>
+        <w:tabs>
+          <w:tab w:val="clear" w:pos="1134"/>
+          <w:tab w:val="left" w:pos="814" w:leader="none"/>
+        </w:tabs>
+        <w:bidi w:val="0"/>
+        <w:spacing w:before="105" w:after="0"/>
+        <w:ind w:hanging="283" w:start="814"/>
+        <w:jc w:val="start"/>
+        <w:rPr/>
+      </w:pPr>
+      <w:r>
+        <w:rPr/>
+        <w:t xml:space="preserve">Keep notification throttling, but update only when displayed values actually change. </w:t>
+      </w:r>
+    </w:p>
+    <w:p>
+      <w:pPr>
+        <w:pStyle w:val="BodyText"/>
+        <w:numPr>
+          <w:ilvl w:val="0"/>
+          <w:numId w:val="20"/>
+        </w:numPr>
+        <w:tabs>
+          <w:tab w:val="clear" w:pos="1134"/>
+          <w:tab w:val="left" w:pos="814" w:leader="none"/>
+        </w:tabs>
+        <w:bidi w:val="0"/>
+        <w:spacing w:before="105" w:after="0"/>
+        <w:ind w:hanging="283" w:start="814"/>
+        <w:jc w:val="start"/>
+        <w:rPr/>
+      </w:pPr>
+      <w:r>
+        <w:rPr/>
+        <w:t xml:space="preserve">Cache date, number and unit formatters rather than rebuilding them for every GPS update. </w:t>
+      </w:r>
+    </w:p>
+    <w:p>
+      <w:pPr>
+        <w:pStyle w:val="BodyText"/>
+        <w:numPr>
+          <w:ilvl w:val="0"/>
+          <w:numId w:val="20"/>
+        </w:numPr>
+        <w:tabs>
+          <w:tab w:val="clear" w:pos="1134"/>
+          <w:tab w:val="left" w:pos="814" w:leader="none"/>
+        </w:tabs>
+        <w:bidi w:val="0"/>
+        <w:spacing w:before="105" w:after="0"/>
+        <w:ind w:hanging="283" w:start="814"/>
+        <w:jc w:val="start"/>
+        <w:rPr/>
+      </w:pPr>
+      <w:r>
+        <w:rPr/>
+        <w:t xml:space="preserve">Avoid repeated string construction for unchanged notification sections. </w:t>
+      </w:r>
+    </w:p>
+    <w:p>
+      <w:pPr>
+        <w:pStyle w:val="BodyText"/>
+        <w:numPr>
+          <w:ilvl w:val="0"/>
+          <w:numId w:val="20"/>
+        </w:numPr>
+        <w:tabs>
+          <w:tab w:val="clear" w:pos="1134"/>
+          <w:tab w:val="left" w:pos="814" w:leader="none"/>
+        </w:tabs>
+        <w:bidi w:val="0"/>
+        <w:ind w:hanging="283" w:start="814"/>
+        <w:jc w:val="start"/>
+        <w:rPr/>
+      </w:pPr>
+      <w:r>
+        <w:rPr/>
+        <w:t xml:space="preserve">Ensure locale changes invalidate formatter caches correctly. </w:t>
+      </w:r>
+    </w:p>
+    <w:p>
+      <w:pPr>
+        <w:pStyle w:val="Heading3"/>
+        <w:numPr>
+          <w:ilvl w:val="0"/>
+          <w:numId w:val="0"/>
+        </w:numPr>
+        <w:bidi w:val="0"/>
+        <w:spacing w:before="330" w:after="120"/>
+        <w:ind w:start="630"/>
+        <w:jc w:val="start"/>
+        <w:rPr/>
+      </w:pPr>
+      <w:r>
+        <w:rPr/>
+        <w:t>9. Reduce startup time and application size</w:t>
+      </w:r>
+    </w:p>
+    <w:p>
+      <w:pPr>
+        <w:pStyle w:val="BodyText"/>
+        <w:numPr>
+          <w:ilvl w:val="0"/>
+          <w:numId w:val="21"/>
+        </w:numPr>
+        <w:tabs>
+          <w:tab w:val="clear" w:pos="1134"/>
+          <w:tab w:val="left" w:pos="814" w:leader="none"/>
+        </w:tabs>
+        <w:bidi w:val="0"/>
+        <w:spacing w:before="105" w:after="0"/>
+        <w:ind w:hanging="283" w:start="814"/>
+        <w:jc w:val="start"/>
+        <w:rPr/>
+      </w:pPr>
+      <w:r>
+        <w:rPr/>
+        <w:t xml:space="preserve">Remove unused drawable resources. </w:t>
+      </w:r>
+    </w:p>
+    <w:p>
+      <w:pPr>
+        <w:pStyle w:val="BodyText"/>
+        <w:numPr>
+          <w:ilvl w:val="0"/>
+          <w:numId w:val="21"/>
+        </w:numPr>
+        <w:tabs>
+          <w:tab w:val="clear" w:pos="1134"/>
+          <w:tab w:val="left" w:pos="814" w:leader="none"/>
+        </w:tabs>
+        <w:bidi w:val="0"/>
+        <w:spacing w:before="105" w:after="0"/>
+        <w:ind w:hanging="283" w:start="814"/>
+        <w:jc w:val="start"/>
+        <w:rPr/>
+      </w:pPr>
+      <w:r>
+        <w:rPr/>
+        <w:t xml:space="preserve">Review MapLibre native libraries and ABI filters. </w:t>
+      </w:r>
+    </w:p>
+    <w:p>
+      <w:pPr>
+        <w:pStyle w:val="BodyText"/>
+        <w:numPr>
+          <w:ilvl w:val="0"/>
+          <w:numId w:val="21"/>
+        </w:numPr>
+        <w:tabs>
+          <w:tab w:val="clear" w:pos="1134"/>
+          <w:tab w:val="left" w:pos="814" w:leader="none"/>
+        </w:tabs>
+        <w:bidi w:val="0"/>
+        <w:spacing w:before="105" w:after="0"/>
+        <w:ind w:hanging="283" w:start="814"/>
+        <w:jc w:val="start"/>
+        <w:rPr/>
+      </w:pPr>
+      <w:r>
+        <w:rPr/>
+        <w:t xml:space="preserve">Verify that release R8/resource shrinking is effective. </w:t>
+      </w:r>
+    </w:p>
+    <w:p>
+      <w:pPr>
+        <w:pStyle w:val="BodyText"/>
+        <w:numPr>
+          <w:ilvl w:val="0"/>
+          <w:numId w:val="21"/>
+        </w:numPr>
+        <w:tabs>
+          <w:tab w:val="clear" w:pos="1134"/>
+          <w:tab w:val="left" w:pos="814" w:leader="none"/>
+        </w:tabs>
+        <w:bidi w:val="0"/>
+        <w:spacing w:before="105" w:after="0"/>
+        <w:ind w:hanging="283" w:start="814"/>
+        <w:jc w:val="start"/>
+        <w:rPr/>
+      </w:pPr>
+      <w:r>
+        <w:rPr/>
+        <w:t xml:space="preserve">Use baseline profiles for startup, live-screen rendering and navigation. </w:t>
+      </w:r>
+    </w:p>
+    <w:p>
+      <w:pPr>
+        <w:pStyle w:val="BodyText"/>
+        <w:numPr>
+          <w:ilvl w:val="0"/>
+          <w:numId w:val="21"/>
+        </w:numPr>
+        <w:tabs>
+          <w:tab w:val="clear" w:pos="1134"/>
+          <w:tab w:val="left" w:pos="814" w:leader="none"/>
+        </w:tabs>
+        <w:bidi w:val="0"/>
+        <w:spacing w:before="105" w:after="0"/>
+        <w:ind w:hanging="283" w:start="814"/>
+        <w:jc w:val="start"/>
+        <w:rPr/>
+      </w:pPr>
+      <w:r>
+        <w:rPr/>
+        <w:t xml:space="preserve">Delay initialization of map, voice, sensor and nonessential garage components until needed. </w:t>
+      </w:r>
+    </w:p>
+    <w:p>
+      <w:pPr>
+        <w:pStyle w:val="BodyText"/>
+        <w:numPr>
+          <w:ilvl w:val="0"/>
+          <w:numId w:val="21"/>
+        </w:numPr>
+        <w:tabs>
+          <w:tab w:val="clear" w:pos="1134"/>
+          <w:tab w:val="left" w:pos="814" w:leader="none"/>
+        </w:tabs>
+        <w:bidi w:val="0"/>
+        <w:ind w:hanging="283" w:start="814"/>
+        <w:jc w:val="start"/>
+        <w:rPr/>
+      </w:pPr>
+      <w:r>
+        <w:rPr/>
+        <w:t xml:space="preserve">Measure cold start, warm start and first-frame time on representative devices. </w:t>
+      </w:r>
+    </w:p>
+    <w:p>
+      <w:pPr>
+        <w:pStyle w:val="Heading3"/>
+        <w:numPr>
+          <w:ilvl w:val="0"/>
+          <w:numId w:val="0"/>
+        </w:numPr>
+        <w:bidi w:val="0"/>
+        <w:spacing w:before="330" w:after="120"/>
+        <w:ind w:start="630"/>
+        <w:jc w:val="start"/>
+        <w:rPr/>
+      </w:pPr>
+      <w:r>
+        <w:rPr/>
+        <w:t>10. Profile before and after each change</w:t>
+      </w:r>
+    </w:p>
+    <w:tbl>
+      <w:tblPr>
+        <w:tblW w:w="10205" w:type="dxa"/>
+        <w:jc w:val="start"/>
+        <w:tblInd w:w="0" w:type="dxa"/>
+        <w:tblLayout w:type="fixed"/>
+        <w:tblCellMar>
+          <w:top w:w="28" w:type="dxa"/>
+          <w:start w:w="28" w:type="dxa"/>
+          <w:bottom w:w="28" w:type="dxa"/>
+          <w:end w:w="28" w:type="dxa"/>
+        </w:tblCellMar>
+      </w:tblPr>
+      <w:tblGrid>
+        <w:gridCol w:w="3135"/>
+        <w:gridCol w:w="7070"/>
+      </w:tblGrid>
+      <w:tr>
+        <w:trPr/>
+        <w:tc>
+          <w:tcPr>
+            <w:tcW w:w="3135" w:type="dxa"/>
+            <w:tcBorders/>
+            <w:vAlign w:val="center"/>
+          </w:tcPr>
+          <w:p>
+            <w:pPr>
+              <w:pStyle w:val="TableHeading"/>
+              <w:suppressLineNumbers/>
+              <w:bidi w:val="0"/>
+              <w:spacing w:before="105" w:after="105"/>
+              <w:jc w:val="center"/>
+              <w:rPr/>
+            </w:pPr>
+            <w:r>
+              <w:rPr/>
+              <w:t>Tool</w:t>
+            </w:r>
+          </w:p>
+        </w:tc>
+        <w:tc>
+          <w:tcPr>
+            <w:tcW w:w="7070" w:type="dxa"/>
+            <w:tcBorders/>
+            <w:vAlign w:val="center"/>
+          </w:tcPr>
+          <w:p>
+            <w:pPr>
+              <w:pStyle w:val="TableHeading"/>
+              <w:suppressLineNumbers/>
+              <w:bidi w:val="0"/>
+              <w:spacing w:before="105" w:after="105"/>
+              <w:jc w:val="center"/>
+              <w:rPr/>
+            </w:pPr>
+            <w:r>
+              <w:rPr/>
+              <w:t>Use</w:t>
+            </w:r>
+          </w:p>
+        </w:tc>
+      </w:tr>
+      <w:tr>
+        <w:trPr/>
+        <w:tc>
+          <w:tcPr>
+            <w:tcW w:w="3135" w:type="dxa"/>
+            <w:tcBorders/>
+            <w:vAlign w:val="center"/>
+          </w:tcPr>
+          <w:p>
+            <w:pPr>
+              <w:pStyle w:val="TableContents"/>
+              <w:bidi w:val="0"/>
+              <w:spacing w:before="105" w:after="105"/>
+              <w:jc w:val="start"/>
+              <w:rPr/>
+            </w:pPr>
+            <w:r>
+              <w:rPr/>
+              <w:t>Android Studio CPU Profiler</w:t>
+            </w:r>
+          </w:p>
+        </w:tc>
+        <w:tc>
+          <w:tcPr>
+            <w:tcW w:w="7070" w:type="dxa"/>
+            <w:tcBorders/>
+            <w:vAlign w:val="center"/>
+          </w:tcPr>
+          <w:p>
+            <w:pPr>
+              <w:pStyle w:val="TableContents"/>
+              <w:bidi w:val="0"/>
+              <w:spacing w:before="105" w:after="105"/>
+              <w:jc w:val="start"/>
+              <w:rPr/>
+            </w:pPr>
+            <w:r>
+              <w:rPr/>
+              <w:t>Find hot methods in GPS processing, services and database work</w:t>
+            </w:r>
+          </w:p>
+        </w:tc>
+      </w:tr>
+      <w:tr>
+        <w:trPr/>
+        <w:tc>
+          <w:tcPr>
+            <w:tcW w:w="3135" w:type="dxa"/>
+            <w:tcBorders/>
+            <w:vAlign w:val="center"/>
+          </w:tcPr>
+          <w:p>
+            <w:pPr>
+              <w:pStyle w:val="TableContents"/>
+              <w:bidi w:val="0"/>
+              <w:spacing w:before="105" w:after="105"/>
+              <w:jc w:val="start"/>
+              <w:rPr/>
+            </w:pPr>
+            <w:r>
+              <w:rPr/>
+              <w:t>Compose Layout Inspector</w:t>
+            </w:r>
+          </w:p>
+        </w:tc>
+        <w:tc>
+          <w:tcPr>
+            <w:tcW w:w="7070" w:type="dxa"/>
+            <w:tcBorders/>
+            <w:vAlign w:val="center"/>
+          </w:tcPr>
+          <w:p>
+            <w:pPr>
+              <w:pStyle w:val="TableContents"/>
+              <w:bidi w:val="0"/>
+              <w:spacing w:before="105" w:after="105"/>
+              <w:jc w:val="start"/>
+              <w:rPr/>
+            </w:pPr>
+            <w:r>
+              <w:rPr/>
+              <w:t>Identify excessive recompositions and unstable parameters</w:t>
+            </w:r>
+          </w:p>
+        </w:tc>
+      </w:tr>
+      <w:tr>
+        <w:trPr/>
+        <w:tc>
+          <w:tcPr>
+            <w:tcW w:w="3135" w:type="dxa"/>
+            <w:tcBorders/>
+            <w:vAlign w:val="center"/>
+          </w:tcPr>
+          <w:p>
+            <w:pPr>
+              <w:pStyle w:val="TableContents"/>
+              <w:bidi w:val="0"/>
+              <w:spacing w:before="105" w:after="105"/>
+              <w:jc w:val="start"/>
+              <w:rPr/>
+            </w:pPr>
+            <w:r>
+              <w:rPr/>
+              <w:t>Perfetto/System Trace</w:t>
+            </w:r>
+          </w:p>
+        </w:tc>
+        <w:tc>
+          <w:tcPr>
+            <w:tcW w:w="7070" w:type="dxa"/>
+            <w:tcBorders/>
+            <w:vAlign w:val="center"/>
+          </w:tcPr>
+          <w:p>
+            <w:pPr>
+              <w:pStyle w:val="TableContents"/>
+              <w:bidi w:val="0"/>
+              <w:spacing w:before="105" w:after="105"/>
+              <w:jc w:val="start"/>
+              <w:rPr/>
+            </w:pPr>
+            <w:r>
+              <w:rPr/>
+              <w:t>Analyze frame drops, scheduling, wakeups and background work</w:t>
+            </w:r>
+          </w:p>
+        </w:tc>
+      </w:tr>
+      <w:tr>
+        <w:trPr/>
+        <w:tc>
+          <w:tcPr>
+            <w:tcW w:w="3135" w:type="dxa"/>
+            <w:tcBorders/>
+            <w:vAlign w:val="center"/>
+          </w:tcPr>
+          <w:p>
+            <w:pPr>
+              <w:pStyle w:val="TableContents"/>
+              <w:bidi w:val="0"/>
+              <w:spacing w:before="105" w:after="105"/>
+              <w:jc w:val="start"/>
+              <w:rPr/>
+            </w:pPr>
+            <w:r>
+              <w:rPr/>
+              <w:t>Room query logging</w:t>
+            </w:r>
+          </w:p>
+        </w:tc>
+        <w:tc>
+          <w:tcPr>
+            <w:tcW w:w="7070" w:type="dxa"/>
+            <w:tcBorders/>
+            <w:vAlign w:val="center"/>
+          </w:tcPr>
+          <w:p>
+            <w:pPr>
+              <w:pStyle w:val="TableContents"/>
+              <w:bidi w:val="0"/>
+              <w:spacing w:before="105" w:after="105"/>
+              <w:jc w:val="start"/>
+              <w:rPr/>
+            </w:pPr>
+            <w:r>
+              <w:rPr/>
+              <w:t>Find slow queries and excessive database reads</w:t>
+            </w:r>
+          </w:p>
+        </w:tc>
+      </w:tr>
+      <w:tr>
+        <w:trPr/>
+        <w:tc>
+          <w:tcPr>
+            <w:tcW w:w="3135" w:type="dxa"/>
+            <w:tcBorders/>
+            <w:vAlign w:val="center"/>
+          </w:tcPr>
+          <w:p>
+            <w:pPr>
+              <w:pStyle w:val="TableContents"/>
+              <w:bidi w:val="0"/>
+              <w:spacing w:before="105" w:after="105"/>
+              <w:jc w:val="start"/>
+              <w:rPr/>
+            </w:pPr>
+            <w:r>
+              <w:rPr/>
+              <w:t>Memory Profiler</w:t>
+            </w:r>
+          </w:p>
+        </w:tc>
+        <w:tc>
+          <w:tcPr>
+            <w:tcW w:w="7070" w:type="dxa"/>
+            <w:tcBorders/>
+            <w:vAlign w:val="center"/>
+          </w:tcPr>
+          <w:p>
+            <w:pPr>
+              <w:pStyle w:val="TableContents"/>
+              <w:bidi w:val="0"/>
+              <w:spacing w:before="105" w:after="105"/>
+              <w:jc w:val="start"/>
+              <w:rPr/>
+            </w:pPr>
+            <w:r>
+              <w:rPr/>
+              <w:t>Detect queue growth, route-memory spikes and import leaks</w:t>
+            </w:r>
+          </w:p>
+        </w:tc>
+      </w:tr>
+      <w:tr>
+        <w:trPr/>
+        <w:tc>
+          <w:tcPr>
+            <w:tcW w:w="3135" w:type="dxa"/>
+            <w:tcBorders/>
+            <w:vAlign w:val="center"/>
+          </w:tcPr>
+          <w:p>
+            <w:pPr>
+              <w:pStyle w:val="TableContents"/>
+              <w:bidi w:val="0"/>
+              <w:spacing w:before="105" w:after="105"/>
+              <w:jc w:val="start"/>
+              <w:rPr/>
+            </w:pPr>
+            <w:r>
+              <w:rPr/>
+              <w:t>Macrobenchmark</w:t>
+            </w:r>
+          </w:p>
+        </w:tc>
+        <w:tc>
+          <w:tcPr>
+            <w:tcW w:w="7070" w:type="dxa"/>
+            <w:tcBorders/>
+            <w:vAlign w:val="center"/>
+          </w:tcPr>
+          <w:p>
+            <w:pPr>
+              <w:pStyle w:val="TableContents"/>
+              <w:bidi w:val="0"/>
+              <w:spacing w:before="105" w:after="105"/>
+              <w:jc w:val="start"/>
+              <w:rPr/>
+            </w:pPr>
+            <w:r>
+              <w:rPr/>
+              <w:t>Measure startup, navigation and live-screen performance over time</w:t>
+            </w:r>
+          </w:p>
+        </w:tc>
+      </w:tr>
+    </w:tbl>
+    <w:p>
+      <w:pPr>
+        <w:pStyle w:val="Heading3"/>
+        <w:numPr>
+          <w:ilvl w:val="0"/>
+          <w:numId w:val="0"/>
+        </w:numPr>
+        <w:bidi w:val="0"/>
+        <w:spacing w:before="330" w:after="120"/>
+        <w:ind w:start="630"/>
+        <w:jc w:val="start"/>
+        <w:rPr/>
+      </w:pPr>
+      <w:r>
+        <w:rPr/>
+        <w:t>Recommended first performance pass</w:t>
+      </w:r>
+    </w:p>
+    <w:p>
+      <w:pPr>
+        <w:pStyle w:val="BodyText"/>
+        <w:numPr>
+          <w:ilvl w:val="0"/>
+          <w:numId w:val="22"/>
+        </w:numPr>
+        <w:tabs>
+          <w:tab w:val="clear" w:pos="1134"/>
+          <w:tab w:val="left" w:pos="814" w:leader="none"/>
+        </w:tabs>
+        <w:bidi w:val="0"/>
+        <w:spacing w:before="105" w:after="0"/>
+        <w:ind w:hanging="283" w:start="814"/>
+        <w:jc w:val="start"/>
+        <w:rPr/>
+      </w:pPr>
+      <w:r>
+        <w:rPr/>
+        <w:t xml:space="preserve">Fix the point queue and database writer. </w:t>
+      </w:r>
+    </w:p>
+    <w:p>
+      <w:pPr>
+        <w:pStyle w:val="BodyText"/>
+        <w:numPr>
+          <w:ilvl w:val="0"/>
+          <w:numId w:val="22"/>
+        </w:numPr>
+        <w:tabs>
+          <w:tab w:val="clear" w:pos="1134"/>
+          <w:tab w:val="left" w:pos="814" w:leader="none"/>
+        </w:tabs>
+        <w:bidi w:val="0"/>
+        <w:spacing w:before="105" w:after="0"/>
+        <w:ind w:hanging="283" w:start="814"/>
+        <w:jc w:val="start"/>
+        <w:rPr/>
+      </w:pPr>
+      <w:r>
+        <w:rPr/>
+        <w:t xml:space="preserve">Stop storing rejected GPS points. </w:t>
+      </w:r>
+    </w:p>
+    <w:p>
+      <w:pPr>
+        <w:pStyle w:val="BodyText"/>
+        <w:numPr>
+          <w:ilvl w:val="0"/>
+          <w:numId w:val="22"/>
+        </w:numPr>
+        <w:tabs>
+          <w:tab w:val="clear" w:pos="1134"/>
+          <w:tab w:val="left" w:pos="814" w:leader="none"/>
+        </w:tabs>
+        <w:bidi w:val="0"/>
+        <w:spacing w:before="105" w:after="0"/>
+        <w:ind w:hanging="283" w:start="814"/>
+        <w:jc w:val="start"/>
+        <w:rPr/>
+      </w:pPr>
+      <w:r>
+        <w:rPr/>
+        <w:t xml:space="preserve">Confine tracking state to one coroutine. </w:t>
+      </w:r>
+    </w:p>
+    <w:p>
+      <w:pPr>
+        <w:pStyle w:val="BodyText"/>
+        <w:numPr>
+          <w:ilvl w:val="0"/>
+          <w:numId w:val="22"/>
+        </w:numPr>
+        <w:tabs>
+          <w:tab w:val="clear" w:pos="1134"/>
+          <w:tab w:val="left" w:pos="814" w:leader="none"/>
+        </w:tabs>
+        <w:bidi w:val="0"/>
+        <w:spacing w:before="105" w:after="0"/>
+        <w:ind w:hanging="283" w:start="814"/>
+        <w:jc w:val="start"/>
+        <w:rPr/>
+      </w:pPr>
+      <w:r>
+        <w:rPr/>
+        <w:t xml:space="preserve">Cache and threshold map route updates. </w:t>
+      </w:r>
+    </w:p>
+    <w:p>
+      <w:pPr>
+        <w:pStyle w:val="BodyText"/>
+        <w:numPr>
+          <w:ilvl w:val="0"/>
+          <w:numId w:val="22"/>
+        </w:numPr>
+        <w:tabs>
+          <w:tab w:val="clear" w:pos="1134"/>
+          <w:tab w:val="left" w:pos="814" w:leader="none"/>
+        </w:tabs>
+        <w:bidi w:val="0"/>
+        <w:spacing w:before="105" w:after="0"/>
+        <w:ind w:hanging="283" w:start="814"/>
+        <w:jc w:val="start"/>
+        <w:rPr/>
+      </w:pPr>
+      <w:r>
+        <w:rPr/>
+        <w:t xml:space="preserve">Profile and reduce Compose recompositions. </w:t>
+      </w:r>
+    </w:p>
+    <w:p>
+      <w:pPr>
+        <w:pStyle w:val="BodyText"/>
+        <w:numPr>
+          <w:ilvl w:val="0"/>
+          <w:numId w:val="22"/>
+        </w:numPr>
+        <w:tabs>
+          <w:tab w:val="clear" w:pos="1134"/>
+          <w:tab w:val="left" w:pos="814" w:leader="none"/>
+        </w:tabs>
+        <w:bidi w:val="0"/>
+        <w:ind w:hanging="283" w:start="814"/>
+        <w:jc w:val="start"/>
+        <w:rPr/>
+      </w:pPr>
+      <w:r>
+        <w:rPr/>
+        <w:t xml:space="preserve">Stream large backup and GPX operations. </w:t>
+      </w:r>
+    </w:p>
+    <w:p>
+      <w:pPr>
         <w:pStyle w:val="BodyTextsmall"/>
         <w:bidi w:val="0"/>
         <w:spacing w:before="105" w:after="105"/>
@@ -8710,6 +10449,1221 @@
     </w:lvl>
   </w:abstractNum>
   <w:abstractNum w:abstractNumId="13">
+    <w:lvl w:ilvl="0">
+      <w:start w:val="1"/>
+      <w:numFmt w:val="decimal"/>
+      <w:lvlText w:val="%1."/>
+      <w:lvlJc w:val="start"/>
+      <w:pPr>
+        <w:tabs>
+          <w:tab w:val="num" w:pos="709"/>
+        </w:tabs>
+        <w:ind w:start="709" w:hanging="283"/>
+      </w:pPr>
+      <w:rPr/>
+    </w:lvl>
+    <w:lvl w:ilvl="1">
+      <w:start w:val="1"/>
+      <w:numFmt w:val="decimal"/>
+      <w:lvlText w:val="%2."/>
+      <w:lvlJc w:val="start"/>
+      <w:pPr>
+        <w:tabs>
+          <w:tab w:val="num" w:pos="1418"/>
+        </w:tabs>
+        <w:ind w:start="1418" w:hanging="283"/>
+      </w:pPr>
+      <w:rPr/>
+    </w:lvl>
+    <w:lvl w:ilvl="2">
+      <w:start w:val="1"/>
+      <w:numFmt w:val="decimal"/>
+      <w:lvlText w:val="%3."/>
+      <w:lvlJc w:val="start"/>
+      <w:pPr>
+        <w:tabs>
+          <w:tab w:val="num" w:pos="2127"/>
+        </w:tabs>
+        <w:ind w:start="2127" w:hanging="283"/>
+      </w:pPr>
+      <w:rPr/>
+    </w:lvl>
+    <w:lvl w:ilvl="3">
+      <w:start w:val="1"/>
+      <w:numFmt w:val="decimal"/>
+      <w:lvlText w:val="%4."/>
+      <w:lvlJc w:val="start"/>
+      <w:pPr>
+        <w:tabs>
+          <w:tab w:val="num" w:pos="2836"/>
+        </w:tabs>
+        <w:ind w:start="2836" w:hanging="283"/>
+      </w:pPr>
+      <w:rPr/>
+    </w:lvl>
+    <w:lvl w:ilvl="4">
+      <w:start w:val="1"/>
+      <w:numFmt w:val="decimal"/>
+      <w:lvlText w:val="%5."/>
+      <w:lvlJc w:val="start"/>
+      <w:pPr>
+        <w:tabs>
+          <w:tab w:val="num" w:pos="3545"/>
+        </w:tabs>
+        <w:ind w:start="3545" w:hanging="283"/>
+      </w:pPr>
+      <w:rPr/>
+    </w:lvl>
+    <w:lvl w:ilvl="5">
+      <w:start w:val="1"/>
+      <w:numFmt w:val="decimal"/>
+      <w:lvlText w:val="%6."/>
+      <w:lvlJc w:val="start"/>
+      <w:pPr>
+        <w:tabs>
+          <w:tab w:val="num" w:pos="4254"/>
+        </w:tabs>
+        <w:ind w:start="4254" w:hanging="283"/>
+      </w:pPr>
+      <w:rPr/>
+    </w:lvl>
+    <w:lvl w:ilvl="6">
+      <w:start w:val="1"/>
+      <w:numFmt w:val="decimal"/>
+      <w:lvlText w:val="%7."/>
+      <w:lvlJc w:val="start"/>
+      <w:pPr>
+        <w:tabs>
+          <w:tab w:val="num" w:pos="4963"/>
+        </w:tabs>
+        <w:ind w:start="4963" w:hanging="283"/>
+      </w:pPr>
+      <w:rPr/>
+    </w:lvl>
+    <w:lvl w:ilvl="7">
+      <w:start w:val="1"/>
+      <w:numFmt w:val="decimal"/>
+      <w:lvlText w:val="%8."/>
+      <w:lvlJc w:val="start"/>
+      <w:pPr>
+        <w:tabs>
+          <w:tab w:val="num" w:pos="5672"/>
+        </w:tabs>
+        <w:ind w:start="5672" w:hanging="283"/>
+      </w:pPr>
+      <w:rPr/>
+    </w:lvl>
+    <w:lvl w:ilvl="8">
+      <w:start w:val="1"/>
+      <w:numFmt w:val="decimal"/>
+      <w:lvlText w:val="%9."/>
+      <w:lvlJc w:val="start"/>
+      <w:pPr>
+        <w:tabs>
+          <w:tab w:val="num" w:pos="6381"/>
+        </w:tabs>
+        <w:ind w:start="6381" w:hanging="283"/>
+      </w:pPr>
+      <w:rPr/>
+    </w:lvl>
+  </w:abstractNum>
+  <w:abstractNum w:abstractNumId="14">
+    <w:lvl w:ilvl="0">
+      <w:start w:val="1"/>
+      <w:numFmt w:val="bullet"/>
+      <w:lvlText w:val=""/>
+      <w:lvlJc w:val="start"/>
+      <w:pPr>
+        <w:tabs>
+          <w:tab w:val="num" w:pos="709"/>
+        </w:tabs>
+        <w:ind w:start="709" w:hanging="283"/>
+      </w:pPr>
+      <w:rPr>
+        <w:rFonts w:ascii="Symbol" w:hAnsi="Symbol" w:cs="Symbol" w:hint="default"/>
+      </w:rPr>
+    </w:lvl>
+    <w:lvl w:ilvl="1">
+      <w:start w:val="1"/>
+      <w:numFmt w:val="bullet"/>
+      <w:lvlText w:val=""/>
+      <w:lvlJc w:val="start"/>
+      <w:pPr>
+        <w:tabs>
+          <w:tab w:val="num" w:pos="1418"/>
+        </w:tabs>
+        <w:ind w:start="1418" w:hanging="283"/>
+      </w:pPr>
+      <w:rPr>
+        <w:rFonts w:ascii="Symbol" w:hAnsi="Symbol" w:cs="Symbol" w:hint="default"/>
+      </w:rPr>
+    </w:lvl>
+    <w:lvl w:ilvl="2">
+      <w:start w:val="1"/>
+      <w:numFmt w:val="bullet"/>
+      <w:lvlText w:val=""/>
+      <w:lvlJc w:val="start"/>
+      <w:pPr>
+        <w:tabs>
+          <w:tab w:val="num" w:pos="2127"/>
+        </w:tabs>
+        <w:ind w:start="2127" w:hanging="283"/>
+      </w:pPr>
+      <w:rPr>
+        <w:rFonts w:ascii="Symbol" w:hAnsi="Symbol" w:cs="Symbol" w:hint="default"/>
+      </w:rPr>
+    </w:lvl>
+    <w:lvl w:ilvl="3">
+      <w:start w:val="1"/>
+      <w:numFmt w:val="bullet"/>
+      <w:lvlText w:val=""/>
+      <w:lvlJc w:val="start"/>
+      <w:pPr>
+        <w:tabs>
+          <w:tab w:val="num" w:pos="2836"/>
+        </w:tabs>
+        <w:ind w:start="2836" w:hanging="283"/>
+      </w:pPr>
+      <w:rPr>
+        <w:rFonts w:ascii="Symbol" w:hAnsi="Symbol" w:cs="Symbol" w:hint="default"/>
+      </w:rPr>
+    </w:lvl>
+    <w:lvl w:ilvl="4">
+      <w:start w:val="1"/>
+      <w:numFmt w:val="bullet"/>
+      <w:lvlText w:val=""/>
+      <w:lvlJc w:val="start"/>
+      <w:pPr>
+        <w:tabs>
+          <w:tab w:val="num" w:pos="3545"/>
+        </w:tabs>
+        <w:ind w:start="3545" w:hanging="283"/>
+      </w:pPr>
+      <w:rPr>
+        <w:rFonts w:ascii="Symbol" w:hAnsi="Symbol" w:cs="Symbol" w:hint="default"/>
+      </w:rPr>
+    </w:lvl>
+    <w:lvl w:ilvl="5">
+      <w:start w:val="1"/>
+      <w:numFmt w:val="bullet"/>
+      <w:lvlText w:val=""/>
+      <w:lvlJc w:val="start"/>
+      <w:pPr>
+        <w:tabs>
+          <w:tab w:val="num" w:pos="4254"/>
+        </w:tabs>
+        <w:ind w:start="4254" w:hanging="283"/>
+      </w:pPr>
+      <w:rPr>
+        <w:rFonts w:ascii="Symbol" w:hAnsi="Symbol" w:cs="Symbol" w:hint="default"/>
+      </w:rPr>
+    </w:lvl>
+    <w:lvl w:ilvl="6">
+      <w:start w:val="1"/>
+      <w:numFmt w:val="bullet"/>
+      <w:lvlText w:val=""/>
+      <w:lvlJc w:val="start"/>
+      <w:pPr>
+        <w:tabs>
+          <w:tab w:val="num" w:pos="4963"/>
+        </w:tabs>
+        <w:ind w:start="4963" w:hanging="283"/>
+      </w:pPr>
+      <w:rPr>
+        <w:rFonts w:ascii="Symbol" w:hAnsi="Symbol" w:cs="Symbol" w:hint="default"/>
+      </w:rPr>
+    </w:lvl>
+    <w:lvl w:ilvl="7">
+      <w:start w:val="1"/>
+      <w:numFmt w:val="bullet"/>
+      <w:lvlText w:val=""/>
+      <w:lvlJc w:val="start"/>
+      <w:pPr>
+        <w:tabs>
+          <w:tab w:val="num" w:pos="5672"/>
+        </w:tabs>
+        <w:ind w:start="5672" w:hanging="283"/>
+      </w:pPr>
+      <w:rPr>
+        <w:rFonts w:ascii="Symbol" w:hAnsi="Symbol" w:cs="Symbol" w:hint="default"/>
+      </w:rPr>
+    </w:lvl>
+    <w:lvl w:ilvl="8">
+      <w:start w:val="1"/>
+      <w:numFmt w:val="bullet"/>
+      <w:lvlText w:val=""/>
+      <w:lvlJc w:val="start"/>
+      <w:pPr>
+        <w:tabs>
+          <w:tab w:val="num" w:pos="6381"/>
+        </w:tabs>
+        <w:ind w:start="6381" w:hanging="283"/>
+      </w:pPr>
+      <w:rPr>
+        <w:rFonts w:ascii="Symbol" w:hAnsi="Symbol" w:cs="Symbol" w:hint="default"/>
+      </w:rPr>
+    </w:lvl>
+  </w:abstractNum>
+  <w:abstractNum w:abstractNumId="15">
+    <w:lvl w:ilvl="0">
+      <w:start w:val="1"/>
+      <w:numFmt w:val="bullet"/>
+      <w:lvlText w:val=""/>
+      <w:lvlJc w:val="start"/>
+      <w:pPr>
+        <w:tabs>
+          <w:tab w:val="num" w:pos="709"/>
+        </w:tabs>
+        <w:ind w:start="709" w:hanging="283"/>
+      </w:pPr>
+      <w:rPr>
+        <w:rFonts w:ascii="Symbol" w:hAnsi="Symbol" w:cs="Symbol" w:hint="default"/>
+      </w:rPr>
+    </w:lvl>
+    <w:lvl w:ilvl="1">
+      <w:start w:val="1"/>
+      <w:numFmt w:val="bullet"/>
+      <w:lvlText w:val=""/>
+      <w:lvlJc w:val="start"/>
+      <w:pPr>
+        <w:tabs>
+          <w:tab w:val="num" w:pos="1418"/>
+        </w:tabs>
+        <w:ind w:start="1418" w:hanging="283"/>
+      </w:pPr>
+      <w:rPr>
+        <w:rFonts w:ascii="Symbol" w:hAnsi="Symbol" w:cs="Symbol" w:hint="default"/>
+      </w:rPr>
+    </w:lvl>
+    <w:lvl w:ilvl="2">
+      <w:start w:val="1"/>
+      <w:numFmt w:val="bullet"/>
+      <w:lvlText w:val=""/>
+      <w:lvlJc w:val="start"/>
+      <w:pPr>
+        <w:tabs>
+          <w:tab w:val="num" w:pos="2127"/>
+        </w:tabs>
+        <w:ind w:start="2127" w:hanging="283"/>
+      </w:pPr>
+      <w:rPr>
+        <w:rFonts w:ascii="Symbol" w:hAnsi="Symbol" w:cs="Symbol" w:hint="default"/>
+      </w:rPr>
+    </w:lvl>
+    <w:lvl w:ilvl="3">
+      <w:start w:val="1"/>
+      <w:numFmt w:val="bullet"/>
+      <w:lvlText w:val=""/>
+      <w:lvlJc w:val="start"/>
+      <w:pPr>
+        <w:tabs>
+          <w:tab w:val="num" w:pos="2836"/>
+        </w:tabs>
+        <w:ind w:start="2836" w:hanging="283"/>
+      </w:pPr>
+      <w:rPr>
+        <w:rFonts w:ascii="Symbol" w:hAnsi="Symbol" w:cs="Symbol" w:hint="default"/>
+      </w:rPr>
+    </w:lvl>
+    <w:lvl w:ilvl="4">
+      <w:start w:val="1"/>
+      <w:numFmt w:val="bullet"/>
+      <w:lvlText w:val=""/>
+      <w:lvlJc w:val="start"/>
+      <w:pPr>
+        <w:tabs>
+          <w:tab w:val="num" w:pos="3545"/>
+        </w:tabs>
+        <w:ind w:start="3545" w:hanging="283"/>
+      </w:pPr>
+      <w:rPr>
+        <w:rFonts w:ascii="Symbol" w:hAnsi="Symbol" w:cs="Symbol" w:hint="default"/>
+      </w:rPr>
+    </w:lvl>
+    <w:lvl w:ilvl="5">
+      <w:start w:val="1"/>
+      <w:numFmt w:val="bullet"/>
+      <w:lvlText w:val=""/>
+      <w:lvlJc w:val="start"/>
+      <w:pPr>
+        <w:tabs>
+          <w:tab w:val="num" w:pos="4254"/>
+        </w:tabs>
+        <w:ind w:start="4254" w:hanging="283"/>
+      </w:pPr>
+      <w:rPr>
+        <w:rFonts w:ascii="Symbol" w:hAnsi="Symbol" w:cs="Symbol" w:hint="default"/>
+      </w:rPr>
+    </w:lvl>
+    <w:lvl w:ilvl="6">
+      <w:start w:val="1"/>
+      <w:numFmt w:val="bullet"/>
+      <w:lvlText w:val=""/>
+      <w:lvlJc w:val="start"/>
+      <w:pPr>
+        <w:tabs>
+          <w:tab w:val="num" w:pos="4963"/>
+        </w:tabs>
+        <w:ind w:start="4963" w:hanging="283"/>
+      </w:pPr>
+      <w:rPr>
+        <w:rFonts w:ascii="Symbol" w:hAnsi="Symbol" w:cs="Symbol" w:hint="default"/>
+      </w:rPr>
+    </w:lvl>
+    <w:lvl w:ilvl="7">
+      <w:start w:val="1"/>
+      <w:numFmt w:val="bullet"/>
+      <w:lvlText w:val=""/>
+      <w:lvlJc w:val="start"/>
+      <w:pPr>
+        <w:tabs>
+          <w:tab w:val="num" w:pos="5672"/>
+        </w:tabs>
+        <w:ind w:start="5672" w:hanging="283"/>
+      </w:pPr>
+      <w:rPr>
+        <w:rFonts w:ascii="Symbol" w:hAnsi="Symbol" w:cs="Symbol" w:hint="default"/>
+      </w:rPr>
+    </w:lvl>
+    <w:lvl w:ilvl="8">
+      <w:start w:val="1"/>
+      <w:numFmt w:val="bullet"/>
+      <w:lvlText w:val=""/>
+      <w:lvlJc w:val="start"/>
+      <w:pPr>
+        <w:tabs>
+          <w:tab w:val="num" w:pos="6381"/>
+        </w:tabs>
+        <w:ind w:start="6381" w:hanging="283"/>
+      </w:pPr>
+      <w:rPr>
+        <w:rFonts w:ascii="Symbol" w:hAnsi="Symbol" w:cs="Symbol" w:hint="default"/>
+      </w:rPr>
+    </w:lvl>
+  </w:abstractNum>
+  <w:abstractNum w:abstractNumId="16">
+    <w:lvl w:ilvl="0">
+      <w:start w:val="1"/>
+      <w:numFmt w:val="bullet"/>
+      <w:lvlText w:val=""/>
+      <w:lvlJc w:val="start"/>
+      <w:pPr>
+        <w:tabs>
+          <w:tab w:val="num" w:pos="709"/>
+        </w:tabs>
+        <w:ind w:start="709" w:hanging="283"/>
+      </w:pPr>
+      <w:rPr>
+        <w:rFonts w:ascii="Symbol" w:hAnsi="Symbol" w:cs="Symbol" w:hint="default"/>
+      </w:rPr>
+    </w:lvl>
+    <w:lvl w:ilvl="1">
+      <w:start w:val="1"/>
+      <w:numFmt w:val="bullet"/>
+      <w:lvlText w:val=""/>
+      <w:lvlJc w:val="start"/>
+      <w:pPr>
+        <w:tabs>
+          <w:tab w:val="num" w:pos="1418"/>
+        </w:tabs>
+        <w:ind w:start="1418" w:hanging="283"/>
+      </w:pPr>
+      <w:rPr>
+        <w:rFonts w:ascii="Symbol" w:hAnsi="Symbol" w:cs="Symbol" w:hint="default"/>
+      </w:rPr>
+    </w:lvl>
+    <w:lvl w:ilvl="2">
+      <w:start w:val="1"/>
+      <w:numFmt w:val="bullet"/>
+      <w:lvlText w:val=""/>
+      <w:lvlJc w:val="start"/>
+      <w:pPr>
+        <w:tabs>
+          <w:tab w:val="num" w:pos="2127"/>
+        </w:tabs>
+        <w:ind w:start="2127" w:hanging="283"/>
+      </w:pPr>
+      <w:rPr>
+        <w:rFonts w:ascii="Symbol" w:hAnsi="Symbol" w:cs="Symbol" w:hint="default"/>
+      </w:rPr>
+    </w:lvl>
+    <w:lvl w:ilvl="3">
+      <w:start w:val="1"/>
+      <w:numFmt w:val="bullet"/>
+      <w:lvlText w:val=""/>
+      <w:lvlJc w:val="start"/>
+      <w:pPr>
+        <w:tabs>
+          <w:tab w:val="num" w:pos="2836"/>
+        </w:tabs>
+        <w:ind w:start="2836" w:hanging="283"/>
+      </w:pPr>
+      <w:rPr>
+        <w:rFonts w:ascii="Symbol" w:hAnsi="Symbol" w:cs="Symbol" w:hint="default"/>
+      </w:rPr>
+    </w:lvl>
+    <w:lvl w:ilvl="4">
+      <w:start w:val="1"/>
+      <w:numFmt w:val="bullet"/>
+      <w:lvlText w:val=""/>
+      <w:lvlJc w:val="start"/>
+      <w:pPr>
+        <w:tabs>
+          <w:tab w:val="num" w:pos="3545"/>
+        </w:tabs>
+        <w:ind w:start="3545" w:hanging="283"/>
+      </w:pPr>
+      <w:rPr>
+        <w:rFonts w:ascii="Symbol" w:hAnsi="Symbol" w:cs="Symbol" w:hint="default"/>
+      </w:rPr>
+    </w:lvl>
+    <w:lvl w:ilvl="5">
+      <w:start w:val="1"/>
+      <w:numFmt w:val="bullet"/>
+      <w:lvlText w:val=""/>
+      <w:lvlJc w:val="start"/>
+      <w:pPr>
+        <w:tabs>
+          <w:tab w:val="num" w:pos="4254"/>
+        </w:tabs>
+        <w:ind w:start="4254" w:hanging="283"/>
+      </w:pPr>
+      <w:rPr>
+        <w:rFonts w:ascii="Symbol" w:hAnsi="Symbol" w:cs="Symbol" w:hint="default"/>
+      </w:rPr>
+    </w:lvl>
+    <w:lvl w:ilvl="6">
+      <w:start w:val="1"/>
+      <w:numFmt w:val="bullet"/>
+      <w:lvlText w:val=""/>
+      <w:lvlJc w:val="start"/>
+      <w:pPr>
+        <w:tabs>
+          <w:tab w:val="num" w:pos="4963"/>
+        </w:tabs>
+        <w:ind w:start="4963" w:hanging="283"/>
+      </w:pPr>
+      <w:rPr>
+        <w:rFonts w:ascii="Symbol" w:hAnsi="Symbol" w:cs="Symbol" w:hint="default"/>
+      </w:rPr>
+    </w:lvl>
+    <w:lvl w:ilvl="7">
+      <w:start w:val="1"/>
+      <w:numFmt w:val="bullet"/>
+      <w:lvlText w:val=""/>
+      <w:lvlJc w:val="start"/>
+      <w:pPr>
+        <w:tabs>
+          <w:tab w:val="num" w:pos="5672"/>
+        </w:tabs>
+        <w:ind w:start="5672" w:hanging="283"/>
+      </w:pPr>
+      <w:rPr>
+        <w:rFonts w:ascii="Symbol" w:hAnsi="Symbol" w:cs="Symbol" w:hint="default"/>
+      </w:rPr>
+    </w:lvl>
+    <w:lvl w:ilvl="8">
+      <w:start w:val="1"/>
+      <w:numFmt w:val="bullet"/>
+      <w:lvlText w:val=""/>
+      <w:lvlJc w:val="start"/>
+      <w:pPr>
+        <w:tabs>
+          <w:tab w:val="num" w:pos="6381"/>
+        </w:tabs>
+        <w:ind w:start="6381" w:hanging="283"/>
+      </w:pPr>
+      <w:rPr>
+        <w:rFonts w:ascii="Symbol" w:hAnsi="Symbol" w:cs="Symbol" w:hint="default"/>
+      </w:rPr>
+    </w:lvl>
+  </w:abstractNum>
+  <w:abstractNum w:abstractNumId="17">
+    <w:lvl w:ilvl="0">
+      <w:start w:val="1"/>
+      <w:numFmt w:val="bullet"/>
+      <w:lvlText w:val=""/>
+      <w:lvlJc w:val="start"/>
+      <w:pPr>
+        <w:tabs>
+          <w:tab w:val="num" w:pos="709"/>
+        </w:tabs>
+        <w:ind w:start="709" w:hanging="283"/>
+      </w:pPr>
+      <w:rPr>
+        <w:rFonts w:ascii="Symbol" w:hAnsi="Symbol" w:cs="Symbol" w:hint="default"/>
+      </w:rPr>
+    </w:lvl>
+    <w:lvl w:ilvl="1">
+      <w:start w:val="1"/>
+      <w:numFmt w:val="bullet"/>
+      <w:lvlText w:val=""/>
+      <w:lvlJc w:val="start"/>
+      <w:pPr>
+        <w:tabs>
+          <w:tab w:val="num" w:pos="1418"/>
+        </w:tabs>
+        <w:ind w:start="1418" w:hanging="283"/>
+      </w:pPr>
+      <w:rPr>
+        <w:rFonts w:ascii="Symbol" w:hAnsi="Symbol" w:cs="Symbol" w:hint="default"/>
+      </w:rPr>
+    </w:lvl>
+    <w:lvl w:ilvl="2">
+      <w:start w:val="1"/>
+      <w:numFmt w:val="bullet"/>
+      <w:lvlText w:val=""/>
+      <w:lvlJc w:val="start"/>
+      <w:pPr>
+        <w:tabs>
+          <w:tab w:val="num" w:pos="2127"/>
+        </w:tabs>
+        <w:ind w:start="2127" w:hanging="283"/>
+      </w:pPr>
+      <w:rPr>
+        <w:rFonts w:ascii="Symbol" w:hAnsi="Symbol" w:cs="Symbol" w:hint="default"/>
+      </w:rPr>
+    </w:lvl>
+    <w:lvl w:ilvl="3">
+      <w:start w:val="1"/>
+      <w:numFmt w:val="bullet"/>
+      <w:lvlText w:val=""/>
+      <w:lvlJc w:val="start"/>
+      <w:pPr>
+        <w:tabs>
+          <w:tab w:val="num" w:pos="2836"/>
+        </w:tabs>
+        <w:ind w:start="2836" w:hanging="283"/>
+      </w:pPr>
+      <w:rPr>
+        <w:rFonts w:ascii="Symbol" w:hAnsi="Symbol" w:cs="Symbol" w:hint="default"/>
+      </w:rPr>
+    </w:lvl>
+    <w:lvl w:ilvl="4">
+      <w:start w:val="1"/>
+      <w:numFmt w:val="bullet"/>
+      <w:lvlText w:val=""/>
+      <w:lvlJc w:val="start"/>
+      <w:pPr>
+        <w:tabs>
+          <w:tab w:val="num" w:pos="3545"/>
+        </w:tabs>
+        <w:ind w:start="3545" w:hanging="283"/>
+      </w:pPr>
+      <w:rPr>
+        <w:rFonts w:ascii="Symbol" w:hAnsi="Symbol" w:cs="Symbol" w:hint="default"/>
+      </w:rPr>
+    </w:lvl>
+    <w:lvl w:ilvl="5">
+      <w:start w:val="1"/>
+      <w:numFmt w:val="bullet"/>
+      <w:lvlText w:val=""/>
+      <w:lvlJc w:val="start"/>
+      <w:pPr>
+        <w:tabs>
+          <w:tab w:val="num" w:pos="4254"/>
+        </w:tabs>
+        <w:ind w:start="4254" w:hanging="283"/>
+      </w:pPr>
+      <w:rPr>
+        <w:rFonts w:ascii="Symbol" w:hAnsi="Symbol" w:cs="Symbol" w:hint="default"/>
+      </w:rPr>
+    </w:lvl>
+    <w:lvl w:ilvl="6">
+      <w:start w:val="1"/>
+      <w:numFmt w:val="bullet"/>
+      <w:lvlText w:val=""/>
+      <w:lvlJc w:val="start"/>
+      <w:pPr>
+        <w:tabs>
+          <w:tab w:val="num" w:pos="4963"/>
+        </w:tabs>
+        <w:ind w:start="4963" w:hanging="283"/>
+      </w:pPr>
+      <w:rPr>
+        <w:rFonts w:ascii="Symbol" w:hAnsi="Symbol" w:cs="Symbol" w:hint="default"/>
+      </w:rPr>
+    </w:lvl>
+    <w:lvl w:ilvl="7">
+      <w:start w:val="1"/>
+      <w:numFmt w:val="bullet"/>
+      <w:lvlText w:val=""/>
+      <w:lvlJc w:val="start"/>
+      <w:pPr>
+        <w:tabs>
+          <w:tab w:val="num" w:pos="5672"/>
+        </w:tabs>
+        <w:ind w:start="5672" w:hanging="283"/>
+      </w:pPr>
+      <w:rPr>
+        <w:rFonts w:ascii="Symbol" w:hAnsi="Symbol" w:cs="Symbol" w:hint="default"/>
+      </w:rPr>
+    </w:lvl>
+    <w:lvl w:ilvl="8">
+      <w:start w:val="1"/>
+      <w:numFmt w:val="bullet"/>
+      <w:lvlText w:val=""/>
+      <w:lvlJc w:val="start"/>
+      <w:pPr>
+        <w:tabs>
+          <w:tab w:val="num" w:pos="6381"/>
+        </w:tabs>
+        <w:ind w:start="6381" w:hanging="283"/>
+      </w:pPr>
+      <w:rPr>
+        <w:rFonts w:ascii="Symbol" w:hAnsi="Symbol" w:cs="Symbol" w:hint="default"/>
+      </w:rPr>
+    </w:lvl>
+  </w:abstractNum>
+  <w:abstractNum w:abstractNumId="18">
+    <w:lvl w:ilvl="0">
+      <w:start w:val="1"/>
+      <w:numFmt w:val="bullet"/>
+      <w:lvlText w:val=""/>
+      <w:lvlJc w:val="start"/>
+      <w:pPr>
+        <w:tabs>
+          <w:tab w:val="num" w:pos="709"/>
+        </w:tabs>
+        <w:ind w:start="709" w:hanging="283"/>
+      </w:pPr>
+      <w:rPr>
+        <w:rFonts w:ascii="Symbol" w:hAnsi="Symbol" w:cs="Symbol" w:hint="default"/>
+      </w:rPr>
+    </w:lvl>
+    <w:lvl w:ilvl="1">
+      <w:start w:val="1"/>
+      <w:numFmt w:val="bullet"/>
+      <w:lvlText w:val=""/>
+      <w:lvlJc w:val="start"/>
+      <w:pPr>
+        <w:tabs>
+          <w:tab w:val="num" w:pos="1418"/>
+        </w:tabs>
+        <w:ind w:start="1418" w:hanging="283"/>
+      </w:pPr>
+      <w:rPr>
+        <w:rFonts w:ascii="Symbol" w:hAnsi="Symbol" w:cs="Symbol" w:hint="default"/>
+      </w:rPr>
+    </w:lvl>
+    <w:lvl w:ilvl="2">
+      <w:start w:val="1"/>
+      <w:numFmt w:val="bullet"/>
+      <w:lvlText w:val=""/>
+      <w:lvlJc w:val="start"/>
+      <w:pPr>
+        <w:tabs>
+          <w:tab w:val="num" w:pos="2127"/>
+        </w:tabs>
+        <w:ind w:start="2127" w:hanging="283"/>
+      </w:pPr>
+      <w:rPr>
+        <w:rFonts w:ascii="Symbol" w:hAnsi="Symbol" w:cs="Symbol" w:hint="default"/>
+      </w:rPr>
+    </w:lvl>
+    <w:lvl w:ilvl="3">
+      <w:start w:val="1"/>
+      <w:numFmt w:val="bullet"/>
+      <w:lvlText w:val=""/>
+      <w:lvlJc w:val="start"/>
+      <w:pPr>
+        <w:tabs>
+          <w:tab w:val="num" w:pos="2836"/>
+        </w:tabs>
+        <w:ind w:start="2836" w:hanging="283"/>
+      </w:pPr>
+      <w:rPr>
+        <w:rFonts w:ascii="Symbol" w:hAnsi="Symbol" w:cs="Symbol" w:hint="default"/>
+      </w:rPr>
+    </w:lvl>
+    <w:lvl w:ilvl="4">
+      <w:start w:val="1"/>
+      <w:numFmt w:val="bullet"/>
+      <w:lvlText w:val=""/>
+      <w:lvlJc w:val="start"/>
+      <w:pPr>
+        <w:tabs>
+          <w:tab w:val="num" w:pos="3545"/>
+        </w:tabs>
+        <w:ind w:start="3545" w:hanging="283"/>
+      </w:pPr>
+      <w:rPr>
+        <w:rFonts w:ascii="Symbol" w:hAnsi="Symbol" w:cs="Symbol" w:hint="default"/>
+      </w:rPr>
+    </w:lvl>
+    <w:lvl w:ilvl="5">
+      <w:start w:val="1"/>
+      <w:numFmt w:val="bullet"/>
+      <w:lvlText w:val=""/>
+      <w:lvlJc w:val="start"/>
+      <w:pPr>
+        <w:tabs>
+          <w:tab w:val="num" w:pos="4254"/>
+        </w:tabs>
+        <w:ind w:start="4254" w:hanging="283"/>
+      </w:pPr>
+      <w:rPr>
+        <w:rFonts w:ascii="Symbol" w:hAnsi="Symbol" w:cs="Symbol" w:hint="default"/>
+      </w:rPr>
+    </w:lvl>
+    <w:lvl w:ilvl="6">
+      <w:start w:val="1"/>
+      <w:numFmt w:val="bullet"/>
+      <w:lvlText w:val=""/>
+      <w:lvlJc w:val="start"/>
+      <w:pPr>
+        <w:tabs>
+          <w:tab w:val="num" w:pos="4963"/>
+        </w:tabs>
+        <w:ind w:start="4963" w:hanging="283"/>
+      </w:pPr>
+      <w:rPr>
+        <w:rFonts w:ascii="Symbol" w:hAnsi="Symbol" w:cs="Symbol" w:hint="default"/>
+      </w:rPr>
+    </w:lvl>
+    <w:lvl w:ilvl="7">
+      <w:start w:val="1"/>
+      <w:numFmt w:val="bullet"/>
+      <w:lvlText w:val=""/>
+      <w:lvlJc w:val="start"/>
+      <w:pPr>
+        <w:tabs>
+          <w:tab w:val="num" w:pos="5672"/>
+        </w:tabs>
+        <w:ind w:start="5672" w:hanging="283"/>
+      </w:pPr>
+      <w:rPr>
+        <w:rFonts w:ascii="Symbol" w:hAnsi="Symbol" w:cs="Symbol" w:hint="default"/>
+      </w:rPr>
+    </w:lvl>
+    <w:lvl w:ilvl="8">
+      <w:start w:val="1"/>
+      <w:numFmt w:val="bullet"/>
+      <w:lvlText w:val=""/>
+      <w:lvlJc w:val="start"/>
+      <w:pPr>
+        <w:tabs>
+          <w:tab w:val="num" w:pos="6381"/>
+        </w:tabs>
+        <w:ind w:start="6381" w:hanging="283"/>
+      </w:pPr>
+      <w:rPr>
+        <w:rFonts w:ascii="Symbol" w:hAnsi="Symbol" w:cs="Symbol" w:hint="default"/>
+      </w:rPr>
+    </w:lvl>
+  </w:abstractNum>
+  <w:abstractNum w:abstractNumId="19">
+    <w:lvl w:ilvl="0">
+      <w:start w:val="1"/>
+      <w:numFmt w:val="bullet"/>
+      <w:lvlText w:val=""/>
+      <w:lvlJc w:val="start"/>
+      <w:pPr>
+        <w:tabs>
+          <w:tab w:val="num" w:pos="709"/>
+        </w:tabs>
+        <w:ind w:start="709" w:hanging="283"/>
+      </w:pPr>
+      <w:rPr>
+        <w:rFonts w:ascii="Symbol" w:hAnsi="Symbol" w:cs="Symbol" w:hint="default"/>
+      </w:rPr>
+    </w:lvl>
+    <w:lvl w:ilvl="1">
+      <w:start w:val="1"/>
+      <w:numFmt w:val="bullet"/>
+      <w:lvlText w:val=""/>
+      <w:lvlJc w:val="start"/>
+      <w:pPr>
+        <w:tabs>
+          <w:tab w:val="num" w:pos="1418"/>
+        </w:tabs>
+        <w:ind w:start="1418" w:hanging="283"/>
+      </w:pPr>
+      <w:rPr>
+        <w:rFonts w:ascii="Symbol" w:hAnsi="Symbol" w:cs="Symbol" w:hint="default"/>
+      </w:rPr>
+    </w:lvl>
+    <w:lvl w:ilvl="2">
+      <w:start w:val="1"/>
+      <w:numFmt w:val="bullet"/>
+      <w:lvlText w:val=""/>
+      <w:lvlJc w:val="start"/>
+      <w:pPr>
+        <w:tabs>
+          <w:tab w:val="num" w:pos="2127"/>
+        </w:tabs>
+        <w:ind w:start="2127" w:hanging="283"/>
+      </w:pPr>
+      <w:rPr>
+        <w:rFonts w:ascii="Symbol" w:hAnsi="Symbol" w:cs="Symbol" w:hint="default"/>
+      </w:rPr>
+    </w:lvl>
+    <w:lvl w:ilvl="3">
+      <w:start w:val="1"/>
+      <w:numFmt w:val="bullet"/>
+      <w:lvlText w:val=""/>
+      <w:lvlJc w:val="start"/>
+      <w:pPr>
+        <w:tabs>
+          <w:tab w:val="num" w:pos="2836"/>
+        </w:tabs>
+        <w:ind w:start="2836" w:hanging="283"/>
+      </w:pPr>
+      <w:rPr>
+        <w:rFonts w:ascii="Symbol" w:hAnsi="Symbol" w:cs="Symbol" w:hint="default"/>
+      </w:rPr>
+    </w:lvl>
+    <w:lvl w:ilvl="4">
+      <w:start w:val="1"/>
+      <w:numFmt w:val="bullet"/>
+      <w:lvlText w:val=""/>
+      <w:lvlJc w:val="start"/>
+      <w:pPr>
+        <w:tabs>
+          <w:tab w:val="num" w:pos="3545"/>
+        </w:tabs>
+        <w:ind w:start="3545" w:hanging="283"/>
+      </w:pPr>
+      <w:rPr>
+        <w:rFonts w:ascii="Symbol" w:hAnsi="Symbol" w:cs="Symbol" w:hint="default"/>
+      </w:rPr>
+    </w:lvl>
+    <w:lvl w:ilvl="5">
+      <w:start w:val="1"/>
+      <w:numFmt w:val="bullet"/>
+      <w:lvlText w:val=""/>
+      <w:lvlJc w:val="start"/>
+      <w:pPr>
+        <w:tabs>
+          <w:tab w:val="num" w:pos="4254"/>
+        </w:tabs>
+        <w:ind w:start="4254" w:hanging="283"/>
+      </w:pPr>
+      <w:rPr>
+        <w:rFonts w:ascii="Symbol" w:hAnsi="Symbol" w:cs="Symbol" w:hint="default"/>
+      </w:rPr>
+    </w:lvl>
+    <w:lvl w:ilvl="6">
+      <w:start w:val="1"/>
+      <w:numFmt w:val="bullet"/>
+      <w:lvlText w:val=""/>
+      <w:lvlJc w:val="start"/>
+      <w:pPr>
+        <w:tabs>
+          <w:tab w:val="num" w:pos="4963"/>
+        </w:tabs>
+        <w:ind w:start="4963" w:hanging="283"/>
+      </w:pPr>
+      <w:rPr>
+        <w:rFonts w:ascii="Symbol" w:hAnsi="Symbol" w:cs="Symbol" w:hint="default"/>
+      </w:rPr>
+    </w:lvl>
+    <w:lvl w:ilvl="7">
+      <w:start w:val="1"/>
+      <w:numFmt w:val="bullet"/>
+      <w:lvlText w:val=""/>
+      <w:lvlJc w:val="start"/>
+      <w:pPr>
+        <w:tabs>
+          <w:tab w:val="num" w:pos="5672"/>
+        </w:tabs>
+        <w:ind w:start="5672" w:hanging="283"/>
+      </w:pPr>
+      <w:rPr>
+        <w:rFonts w:ascii="Symbol" w:hAnsi="Symbol" w:cs="Symbol" w:hint="default"/>
+      </w:rPr>
+    </w:lvl>
+    <w:lvl w:ilvl="8">
+      <w:start w:val="1"/>
+      <w:numFmt w:val="bullet"/>
+      <w:lvlText w:val=""/>
+      <w:lvlJc w:val="start"/>
+      <w:pPr>
+        <w:tabs>
+          <w:tab w:val="num" w:pos="6381"/>
+        </w:tabs>
+        <w:ind w:start="6381" w:hanging="283"/>
+      </w:pPr>
+      <w:rPr>
+        <w:rFonts w:ascii="Symbol" w:hAnsi="Symbol" w:cs="Symbol" w:hint="default"/>
+      </w:rPr>
+    </w:lvl>
+  </w:abstractNum>
+  <w:abstractNum w:abstractNumId="20">
+    <w:lvl w:ilvl="0">
+      <w:start w:val="1"/>
+      <w:numFmt w:val="bullet"/>
+      <w:lvlText w:val=""/>
+      <w:lvlJc w:val="start"/>
+      <w:pPr>
+        <w:tabs>
+          <w:tab w:val="num" w:pos="709"/>
+        </w:tabs>
+        <w:ind w:start="709" w:hanging="283"/>
+      </w:pPr>
+      <w:rPr>
+        <w:rFonts w:ascii="Symbol" w:hAnsi="Symbol" w:cs="Symbol" w:hint="default"/>
+      </w:rPr>
+    </w:lvl>
+    <w:lvl w:ilvl="1">
+      <w:start w:val="1"/>
+      <w:numFmt w:val="bullet"/>
+      <w:lvlText w:val=""/>
+      <w:lvlJc w:val="start"/>
+      <w:pPr>
+        <w:tabs>
+          <w:tab w:val="num" w:pos="1418"/>
+        </w:tabs>
+        <w:ind w:start="1418" w:hanging="283"/>
+      </w:pPr>
+      <w:rPr>
+        <w:rFonts w:ascii="Symbol" w:hAnsi="Symbol" w:cs="Symbol" w:hint="default"/>
+      </w:rPr>
+    </w:lvl>
+    <w:lvl w:ilvl="2">
+      <w:start w:val="1"/>
+      <w:numFmt w:val="bullet"/>
+      <w:lvlText w:val=""/>
+      <w:lvlJc w:val="start"/>
+      <w:pPr>
+        <w:tabs>
+          <w:tab w:val="num" w:pos="2127"/>
+        </w:tabs>
+        <w:ind w:start="2127" w:hanging="283"/>
+      </w:pPr>
+      <w:rPr>
+        <w:rFonts w:ascii="Symbol" w:hAnsi="Symbol" w:cs="Symbol" w:hint="default"/>
+      </w:rPr>
+    </w:lvl>
+    <w:lvl w:ilvl="3">
+      <w:start w:val="1"/>
+      <w:numFmt w:val="bullet"/>
+      <w:lvlText w:val=""/>
+      <w:lvlJc w:val="start"/>
+      <w:pPr>
+        <w:tabs>
+          <w:tab w:val="num" w:pos="2836"/>
+        </w:tabs>
+        <w:ind w:start="2836" w:hanging="283"/>
+      </w:pPr>
+      <w:rPr>
+        <w:rFonts w:ascii="Symbol" w:hAnsi="Symbol" w:cs="Symbol" w:hint="default"/>
+      </w:rPr>
+    </w:lvl>
+    <w:lvl w:ilvl="4">
+      <w:start w:val="1"/>
+      <w:numFmt w:val="bullet"/>
+      <w:lvlText w:val=""/>
+      <w:lvlJc w:val="start"/>
+      <w:pPr>
+        <w:tabs>
+          <w:tab w:val="num" w:pos="3545"/>
+        </w:tabs>
+        <w:ind w:start="3545" w:hanging="283"/>
+      </w:pPr>
+      <w:rPr>
+        <w:rFonts w:ascii="Symbol" w:hAnsi="Symbol" w:cs="Symbol" w:hint="default"/>
+      </w:rPr>
+    </w:lvl>
+    <w:lvl w:ilvl="5">
+      <w:start w:val="1"/>
+      <w:numFmt w:val="bullet"/>
+      <w:lvlText w:val=""/>
+      <w:lvlJc w:val="start"/>
+      <w:pPr>
+        <w:tabs>
+          <w:tab w:val="num" w:pos="4254"/>
+        </w:tabs>
+        <w:ind w:start="4254" w:hanging="283"/>
+      </w:pPr>
+      <w:rPr>
+        <w:rFonts w:ascii="Symbol" w:hAnsi="Symbol" w:cs="Symbol" w:hint="default"/>
+      </w:rPr>
+    </w:lvl>
+    <w:lvl w:ilvl="6">
+      <w:start w:val="1"/>
+      <w:numFmt w:val="bullet"/>
+      <w:lvlText w:val=""/>
+      <w:lvlJc w:val="start"/>
+      <w:pPr>
+        <w:tabs>
+          <w:tab w:val="num" w:pos="4963"/>
+        </w:tabs>
+        <w:ind w:start="4963" w:hanging="283"/>
+      </w:pPr>
+      <w:rPr>
+        <w:rFonts w:ascii="Symbol" w:hAnsi="Symbol" w:cs="Symbol" w:hint="default"/>
+      </w:rPr>
+    </w:lvl>
+    <w:lvl w:ilvl="7">
+      <w:start w:val="1"/>
+      <w:numFmt w:val="bullet"/>
+      <w:lvlText w:val=""/>
+      <w:lvlJc w:val="start"/>
+      <w:pPr>
+        <w:tabs>
+          <w:tab w:val="num" w:pos="5672"/>
+        </w:tabs>
+        <w:ind w:start="5672" w:hanging="283"/>
+      </w:pPr>
+      <w:rPr>
+        <w:rFonts w:ascii="Symbol" w:hAnsi="Symbol" w:cs="Symbol" w:hint="default"/>
+      </w:rPr>
+    </w:lvl>
+    <w:lvl w:ilvl="8">
+      <w:start w:val="1"/>
+      <w:numFmt w:val="bullet"/>
+      <w:lvlText w:val=""/>
+      <w:lvlJc w:val="start"/>
+      <w:pPr>
+        <w:tabs>
+          <w:tab w:val="num" w:pos="6381"/>
+        </w:tabs>
+        <w:ind w:start="6381" w:hanging="283"/>
+      </w:pPr>
+      <w:rPr>
+        <w:rFonts w:ascii="Symbol" w:hAnsi="Symbol" w:cs="Symbol" w:hint="default"/>
+      </w:rPr>
+    </w:lvl>
+  </w:abstractNum>
+  <w:abstractNum w:abstractNumId="21">
+    <w:lvl w:ilvl="0">
+      <w:start w:val="1"/>
+      <w:numFmt w:val="bullet"/>
+      <w:lvlText w:val=""/>
+      <w:lvlJc w:val="start"/>
+      <w:pPr>
+        <w:tabs>
+          <w:tab w:val="num" w:pos="709"/>
+        </w:tabs>
+        <w:ind w:start="709" w:hanging="283"/>
+      </w:pPr>
+      <w:rPr>
+        <w:rFonts w:ascii="Symbol" w:hAnsi="Symbol" w:cs="Symbol" w:hint="default"/>
+      </w:rPr>
+    </w:lvl>
+    <w:lvl w:ilvl="1">
+      <w:start w:val="1"/>
+      <w:numFmt w:val="bullet"/>
+      <w:lvlText w:val=""/>
+      <w:lvlJc w:val="start"/>
+      <w:pPr>
+        <w:tabs>
+          <w:tab w:val="num" w:pos="1418"/>
+        </w:tabs>
+        <w:ind w:start="1418" w:hanging="283"/>
+      </w:pPr>
+      <w:rPr>
+        <w:rFonts w:ascii="Symbol" w:hAnsi="Symbol" w:cs="Symbol" w:hint="default"/>
+      </w:rPr>
+    </w:lvl>
+    <w:lvl w:ilvl="2">
+      <w:start w:val="1"/>
+      <w:numFmt w:val="bullet"/>
+      <w:lvlText w:val=""/>
+      <w:lvlJc w:val="start"/>
+      <w:pPr>
+        <w:tabs>
+          <w:tab w:val="num" w:pos="2127"/>
+        </w:tabs>
+        <w:ind w:start="2127" w:hanging="283"/>
+      </w:pPr>
+      <w:rPr>
+        <w:rFonts w:ascii="Symbol" w:hAnsi="Symbol" w:cs="Symbol" w:hint="default"/>
+      </w:rPr>
+    </w:lvl>
+    <w:lvl w:ilvl="3">
+      <w:start w:val="1"/>
+      <w:numFmt w:val="bullet"/>
+      <w:lvlText w:val=""/>
+      <w:lvlJc w:val="start"/>
+      <w:pPr>
+        <w:tabs>
+          <w:tab w:val="num" w:pos="2836"/>
+        </w:tabs>
+        <w:ind w:start="2836" w:hanging="283"/>
+      </w:pPr>
+      <w:rPr>
+        <w:rFonts w:ascii="Symbol" w:hAnsi="Symbol" w:cs="Symbol" w:hint="default"/>
+      </w:rPr>
+    </w:lvl>
+    <w:lvl w:ilvl="4">
+      <w:start w:val="1"/>
+      <w:numFmt w:val="bullet"/>
+      <w:lvlText w:val=""/>
+      <w:lvlJc w:val="start"/>
+      <w:pPr>
+        <w:tabs>
+          <w:tab w:val="num" w:pos="3545"/>
+        </w:tabs>
+        <w:ind w:start="3545" w:hanging="283"/>
+      </w:pPr>
+      <w:rPr>
+        <w:rFonts w:ascii="Symbol" w:hAnsi="Symbol" w:cs="Symbol" w:hint="default"/>
+      </w:rPr>
+    </w:lvl>
+    <w:lvl w:ilvl="5">
+      <w:start w:val="1"/>
+      <w:numFmt w:val="bullet"/>
+      <w:lvlText w:val=""/>
+      <w:lvlJc w:val="start"/>
+      <w:pPr>
+        <w:tabs>
+          <w:tab w:val="num" w:pos="4254"/>
+        </w:tabs>
+        <w:ind w:start="4254" w:hanging="283"/>
+      </w:pPr>
+      <w:rPr>
+        <w:rFonts w:ascii="Symbol" w:hAnsi="Symbol" w:cs="Symbol" w:hint="default"/>
+      </w:rPr>
+    </w:lvl>
+    <w:lvl w:ilvl="6">
+      <w:start w:val="1"/>
+      <w:numFmt w:val="bullet"/>
+      <w:lvlText w:val=""/>
+      <w:lvlJc w:val="start"/>
+      <w:pPr>
+        <w:tabs>
+          <w:tab w:val="num" w:pos="4963"/>
+        </w:tabs>
+        <w:ind w:start="4963" w:hanging="283"/>
+      </w:pPr>
+      <w:rPr>
+        <w:rFonts w:ascii="Symbol" w:hAnsi="Symbol" w:cs="Symbol" w:hint="default"/>
+      </w:rPr>
+    </w:lvl>
+    <w:lvl w:ilvl="7">
+      <w:start w:val="1"/>
+      <w:numFmt w:val="bullet"/>
+      <w:lvlText w:val=""/>
+      <w:lvlJc w:val="start"/>
+      <w:pPr>
+        <w:tabs>
+          <w:tab w:val="num" w:pos="5672"/>
+        </w:tabs>
+        <w:ind w:start="5672" w:hanging="283"/>
+      </w:pPr>
+      <w:rPr>
+        <w:rFonts w:ascii="Symbol" w:hAnsi="Symbol" w:cs="Symbol" w:hint="default"/>
+      </w:rPr>
+    </w:lvl>
+    <w:lvl w:ilvl="8">
+      <w:start w:val="1"/>
+      <w:numFmt w:val="bullet"/>
+      <w:lvlText w:val=""/>
+      <w:lvlJc w:val="start"/>
+      <w:pPr>
+        <w:tabs>
+          <w:tab w:val="num" w:pos="6381"/>
+        </w:tabs>
+        <w:ind w:start="6381" w:hanging="283"/>
+      </w:pPr>
+      <w:rPr>
+        <w:rFonts w:ascii="Symbol" w:hAnsi="Symbol" w:cs="Symbol" w:hint="default"/>
+      </w:rPr>
+    </w:lvl>
+  </w:abstractNum>
+  <w:abstractNum w:abstractNumId="22">
     <w:lvl w:ilvl="0">
       <w:start w:val="1"/>
       <w:numFmt w:val="decimal"/>
@@ -8866,6 +11820,33 @@
   </w:num>
   <w:num w:numId="13">
     <w:abstractNumId w:val="13"/>
+  </w:num>
+  <w:num w:numId="14">
+    <w:abstractNumId w:val="14"/>
+  </w:num>
+  <w:num w:numId="15">
+    <w:abstractNumId w:val="15"/>
+  </w:num>
+  <w:num w:numId="16">
+    <w:abstractNumId w:val="16"/>
+  </w:num>
+  <w:num w:numId="17">
+    <w:abstractNumId w:val="17"/>
+  </w:num>
+  <w:num w:numId="18">
+    <w:abstractNumId w:val="18"/>
+  </w:num>
+  <w:num w:numId="19">
+    <w:abstractNumId w:val="19"/>
+  </w:num>
+  <w:num w:numId="20">
+    <w:abstractNumId w:val="20"/>
+  </w:num>
+  <w:num w:numId="21">
+    <w:abstractNumId w:val="21"/>
+  </w:num>
+  <w:num w:numId="22">
+    <w:abstractNumId w:val="22"/>
   </w:num>
 </w:numbering>
 </file>

</xml_diff>